<commit_message>
fix(docs): correct 8 factual errors in Expert Reviewer Guide
Verification pass found these errors introduced by the doc generator:
1. Removed "General Strength" exercise tag (doesn't exist)
2. Fixed "Needs Work" card colour from Amber to Red (code: <5.0 = red)
3. Replaced fabricated knee cave threshold with actual knee angle
4. Removed non-existent "Delete" button from My Papers
5. Removed "Click to copy" claim (no clipboard feature exists)
6. Removed fabricated "72 hours" consent withdrawal SLA
7. Fixed Coach Brain candidacy threshold (eval_scores, not form score)
8. Replaced "Foot placement: PARTIAL" with correct unmeasurable dims
</commit_message>
<xml_diff>
--- a/Spelix_Expert_Reviewer_Guide.docx
+++ b/Spelix_Expert_Reviewer_Guide.docx
@@ -2965,7 +2965,7 @@
                 <w:sz w:val="22"/>
                 <w:szCs w:val="22"/>
               </w:rPr>
-              <w:t xml:space="preserve">Truncated identifier shown in grey monospace. Click to copy the full ID.</w:t>
+              <w:t xml:space="preserve">Truncated identifier shown in grey monospace.</w:t>
             </w:r>
           </w:p>
         </w:tc>
@@ -4753,7 +4753,7 @@
                 <w:sz w:val="22"/>
                 <w:szCs w:val="22"/>
               </w:rPr>
-              <w:t xml:space="preserve">Amber</w:t>
+              <w:t xml:space="preserve">Red</w:t>
             </w:r>
           </w:p>
         </w:tc>
@@ -6763,7 +6763,7 @@
                 <w:sz w:val="22"/>
                 <w:szCs w:val="22"/>
               </w:rPr>
-              <w:t xml:space="preserve">Checkboxes: Squat, Bench Press, Deadlift, General Strength. Select all that apply.</w:t>
+              <w:t xml:space="preserve">Checkboxes: Squat, Bench Press, Deadlift. Select all that apply.</w:t>
             </w:r>
           </w:p>
         </w:tc>
@@ -8825,7 +8825,7 @@
                 <w:sz w:val="22"/>
                 <w:szCs w:val="22"/>
               </w:rPr>
-              <w:t xml:space="preserve">Approve &amp; Ingest or Delete button</w:t>
+              <w:t xml:space="preserve">Approve &amp; Ingest button (visible only for pending papers)</w:t>
             </w:r>
           </w:p>
         </w:tc>
@@ -11881,7 +11881,7 @@
                 <w:sz w:val="22"/>
                 <w:szCs w:val="22"/>
               </w:rPr>
-              <w:t xml:space="preserve">Amber card</w:t>
+              <w:t xml:space="preserve">Red card</w:t>
             </w:r>
           </w:p>
         </w:tc>
@@ -12712,7 +12712,7 @@
                 <w:sz w:val="22"/>
                 <w:szCs w:val="22"/>
               </w:rPr>
-              <w:t xml:space="preserve">Not reliably measurable from a single camera angle.</w:t>
+              <w:t xml:space="preserve">Not measurable from a side-view camera.</w:t>
             </w:r>
           </w:p>
         </w:tc>
@@ -12749,7 +12749,7 @@
                 <w:sz w:val="22"/>
                 <w:szCs w:val="22"/>
               </w:rPr>
-              <w:t xml:space="preserve">Bar weight / load</w:t>
+              <w:t xml:space="preserve">Stance width</w:t>
             </w:r>
           </w:p>
         </w:tc>
@@ -12819,7 +12819,7 @@
                 <w:sz w:val="22"/>
                 <w:szCs w:val="22"/>
               </w:rPr>
-              <w:t xml:space="preserve">No weight sensor; cannot be inferred from video.</w:t>
+              <w:t xml:space="preserve">Not measurable from a side-view camera.</w:t>
             </w:r>
           </w:p>
         </w:tc>
@@ -12856,7 +12856,7 @@
                 <w:sz w:val="22"/>
                 <w:szCs w:val="22"/>
               </w:rPr>
-              <w:t xml:space="preserve">Foot placement angle</w:t>
+              <w:t xml:space="preserve">Knee valgus / varus</w:t>
             </w:r>
           </w:p>
         </w:tc>
@@ -12891,7 +12891,7 @@
                 <w:sz w:val="22"/>
                 <w:szCs w:val="22"/>
               </w:rPr>
-              <w:t xml:space="preserve">PARTIAL</w:t>
+              <w:t xml:space="preserve">NO</w:t>
             </w:r>
           </w:p>
         </w:tc>
@@ -12926,7 +12926,7 @@
                 <w:sz w:val="22"/>
                 <w:szCs w:val="22"/>
               </w:rPr>
-              <w:t xml:space="preserve">Visible only if camera angle is favourable.</w:t>
+              <w:t xml:space="preserve">Requires a frontal-view camera. If the AI mentions knee valgus, flag it as a false positive.</w:t>
             </w:r>
           </w:p>
         </w:tc>
@@ -12963,7 +12963,7 @@
                 <w:sz w:val="22"/>
                 <w:szCs w:val="22"/>
               </w:rPr>
-              <w:t xml:space="preserve">Bracing / intra-abdominal pressure</w:t>
+              <w:t xml:space="preserve">Scapular retraction</w:t>
             </w:r>
           </w:p>
         </w:tc>
@@ -13033,7 +13033,7 @@
                 <w:sz w:val="22"/>
                 <w:szCs w:val="22"/>
               </w:rPr>
-              <w:t xml:space="preserve">Not visible; internal pressure cannot be measured.</w:t>
+              <w:t xml:space="preserve">Not visible from a side-view camera.</w:t>
             </w:r>
           </w:p>
         </w:tc>
@@ -13909,7 +13909,7 @@
           <w:sz w:val="22"/>
           <w:szCs w:val="22"/>
         </w:rPr>
-        <w:t xml:space="preserve">When you approve an analysis (score ≥7.0 and no unresolved flags), it becomes a candidate for distillation.</w:t>
+        <w:t xml:space="preserve">When you submit an annotation, the analysis becomes a candidate for distillation if its automated eval scores meet the internal quality threshold.</w:t>
       </w:r>
     </w:p>
     <w:p>
@@ -14235,7 +14235,7 @@
           <w:sz w:val="22"/>
           <w:szCs w:val="22"/>
         </w:rPr>
-        <w:t xml:space="preserve">If a user withdraws their consent, their data is deleted within 72 hours and their analyses are removed from the review queue. You may notice analyses disappearing from the queue — this is expected behaviour.</w:t>
+        <w:t xml:space="preserve">If a user withdraws their consent, a background process removes their data from the Coach Brain and their analyses may be removed from the review queue. You may notice analyses disappearing from the queue — this is expected behaviour.</w:t>
       </w:r>
     </w:p>
     <w:p>
@@ -15847,7 +15847,7 @@
                 <w:sz w:val="22"/>
                 <w:szCs w:val="22"/>
               </w:rPr>
-              <w:t xml:space="preserve">Knee cave at depth</w:t>
+              <w:t xml:space="preserve">Knee angle at depth</w:t>
             </w:r>
           </w:p>
         </w:tc>
@@ -15882,7 +15882,7 @@
                 <w:sz w:val="22"/>
                 <w:szCs w:val="22"/>
               </w:rPr>
-              <w:t xml:space="preserve">&lt;70° knee-to-hip lateral angle</w:t>
+              <w:t xml:space="preserve">&lt;70°</w:t>
             </w:r>
           </w:p>
         </w:tc>
@@ -15917,7 +15917,7 @@
                 <w:sz w:val="22"/>
                 <w:szCs w:val="22"/>
               </w:rPr>
-              <w:t xml:space="preserve">Triggers knee tracking flag.</w:t>
+              <w:t xml:space="preserve">Deep squat indicator.</w:t>
             </w:r>
           </w:p>
         </w:tc>

</xml_diff>

<commit_message>
docs(expert): add failure patterns, quality examples, annotation walkthrough
Three new sections in the Expert Reviewer Guide (4.3–4.5):
- Common AI Failure Patterns: 7 specific watch-for patterns with actions
- Good vs Bad Coaching: side-by-side examples for quality calibration
- Annotation Walkthrough: step-by-step worked example of a squat review
</commit_message>
<xml_diff>
--- a/Spelix_Expert_Reviewer_Guide.docx
+++ b/Spelix_Expert_Reviewer_Guide.docx
@@ -5245,12 +5245,12 @@
           <w:sz w:val="26"/>
           <w:szCs w:val="26"/>
         </w:rPr>
-        <w:t xml:space="preserve">4.3  Previous Annotations</w:t>
-      </w:r>
-    </w:p>
-    <w:p>
-      <w:pPr>
-        <w:spacing w:after="80" w:before="60"/>
+        <w:t xml:space="preserve">4.3  Common AI Failure Patterns</w:t>
+      </w:r>
+    </w:p>
+    <w:p>
+      <w:pPr>
+        <w:spacing w:after="60" w:before="60"/>
         <w:jc w:val="left"/>
       </w:pPr>
       <w:r>
@@ -5261,7 +5261,892 @@
           <w:sz w:val="22"/>
           <w:szCs w:val="22"/>
         </w:rPr>
-        <w:t xml:space="preserve">If you have previously submitted an annotation for this analysis, it appears in a 'Previous Annotations' section above your form. Each past annotation shows the quality score, accuracy ratings, and any corrections you submitted. This lets you see your prior assessments.</w:t>
+        <w:t xml:space="preserve">The AI coaching is generally accurate, but it has known blind spots. Watch for these specific patterns when reviewing:</w:t>
+      </w:r>
+    </w:p>
+    <w:tbl>
+      <w:tblPr>
+        <w:tblW w:type="dxa" w:w="9360"/>
+        <w:tblBorders>
+          <w:top w:val="single" w:color="auto" w:sz="4"/>
+          <w:left w:val="single" w:color="auto" w:sz="4"/>
+          <w:bottom w:val="single" w:color="auto" w:sz="4"/>
+          <w:right w:val="single" w:color="auto" w:sz="4"/>
+          <w:insideH w:val="single" w:color="auto" w:sz="4"/>
+          <w:insideV w:val="single" w:color="auto" w:sz="4"/>
+        </w:tblBorders>
+      </w:tblPr>
+      <w:tblGrid>
+        <w:gridCol w:w="2200"/>
+        <w:gridCol w:w="3800"/>
+        <w:gridCol w:w="3360"/>
+      </w:tblGrid>
+      <w:tr>
+        <w:trPr>
+          <w:tblHeader/>
+        </w:trPr>
+        <w:tc>
+          <w:tcPr>
+            <w:tcW w:type="dxa" w:w="2200"/>
+            <w:tcBorders>
+              <w:top w:val="single" w:color="CCCCCC" w:sz="4"/>
+              <w:left w:val="single" w:color="CCCCCC" w:sz="4"/>
+              <w:bottom w:val="single" w:color="CCCCCC" w:sz="4"/>
+              <w:right w:val="single" w:color="CCCCCC" w:sz="4"/>
+            </w:tcBorders>
+            <w:shd w:fill="2E75B6" w:val="clear"/>
+            <w:tcMar>
+              <w:top w:type="dxa" w:w="80"/>
+              <w:left w:type="dxa" w:w="120"/>
+              <w:bottom w:type="dxa" w:w="80"/>
+              <w:right w:type="dxa" w:w="120"/>
+            </w:tcMar>
+            <w:vAlign w:val="top"/>
+          </w:tcPr>
+          <w:p>
+            <w:pPr>
+              <w:spacing w:after="80" w:before="80"/>
+              <w:jc w:val="left"/>
+            </w:pPr>
+            <w:r>
+              <w:rPr>
+                <w:rFonts w:ascii="Arial" w:cs="Arial" w:eastAsia="Arial" w:hAnsi="Arial"/>
+                <w:b/>
+                <w:bCs/>
+                <w:color w:val="FFFFFF"/>
+                <w:sz w:val="22"/>
+                <w:szCs w:val="22"/>
+              </w:rPr>
+              <w:t xml:space="preserve">Pattern</w:t>
+            </w:r>
+          </w:p>
+        </w:tc>
+        <w:tc>
+          <w:tcPr>
+            <w:tcW w:type="dxa" w:w="3800"/>
+            <w:tcBorders>
+              <w:top w:val="single" w:color="CCCCCC" w:sz="4"/>
+              <w:left w:val="single" w:color="CCCCCC" w:sz="4"/>
+              <w:bottom w:val="single" w:color="CCCCCC" w:sz="4"/>
+              <w:right w:val="single" w:color="CCCCCC" w:sz="4"/>
+            </w:tcBorders>
+            <w:shd w:fill="2E75B6" w:val="clear"/>
+            <w:tcMar>
+              <w:top w:type="dxa" w:w="80"/>
+              <w:left w:type="dxa" w:w="120"/>
+              <w:bottom w:type="dxa" w:w="80"/>
+              <w:right w:type="dxa" w:w="120"/>
+            </w:tcMar>
+            <w:vAlign w:val="top"/>
+          </w:tcPr>
+          <w:p>
+            <w:pPr>
+              <w:spacing w:after="80" w:before="80"/>
+              <w:jc w:val="left"/>
+            </w:pPr>
+            <w:r>
+              <w:rPr>
+                <w:rFonts w:ascii="Arial" w:cs="Arial" w:eastAsia="Arial" w:hAnsi="Arial"/>
+                <w:b/>
+                <w:bCs/>
+                <w:color w:val="FFFFFF"/>
+                <w:sz w:val="22"/>
+                <w:szCs w:val="22"/>
+              </w:rPr>
+              <w:t xml:space="preserve">What To Look For</w:t>
+            </w:r>
+          </w:p>
+        </w:tc>
+        <w:tc>
+          <w:tcPr>
+            <w:tcW w:type="dxa" w:w="3360"/>
+            <w:tcBorders>
+              <w:top w:val="single" w:color="CCCCCC" w:sz="4"/>
+              <w:left w:val="single" w:color="CCCCCC" w:sz="4"/>
+              <w:bottom w:val="single" w:color="CCCCCC" w:sz="4"/>
+              <w:right w:val="single" w:color="CCCCCC" w:sz="4"/>
+            </w:tcBorders>
+            <w:shd w:fill="2E75B6" w:val="clear"/>
+            <w:tcMar>
+              <w:top w:type="dxa" w:w="80"/>
+              <w:left w:type="dxa" w:w="120"/>
+              <w:bottom w:type="dxa" w:w="80"/>
+              <w:right w:type="dxa" w:w="120"/>
+            </w:tcMar>
+            <w:vAlign w:val="top"/>
+          </w:tcPr>
+          <w:p>
+            <w:pPr>
+              <w:spacing w:after="80" w:before="80"/>
+              <w:jc w:val="left"/>
+            </w:pPr>
+            <w:r>
+              <w:rPr>
+                <w:rFonts w:ascii="Arial" w:cs="Arial" w:eastAsia="Arial" w:hAnsi="Arial"/>
+                <w:b/>
+                <w:bCs/>
+                <w:color w:val="FFFFFF"/>
+                <w:sz w:val="22"/>
+                <w:szCs w:val="22"/>
+              </w:rPr>
+              <w:t xml:space="preserve">What To Do</w:t>
+            </w:r>
+          </w:p>
+        </w:tc>
+      </w:tr>
+      <w:tr>
+        <w:tc>
+          <w:tcPr>
+            <w:tcW w:type="dxa" w:w="2200"/>
+            <w:tcBorders>
+              <w:top w:val="single" w:color="CCCCCC" w:sz="4"/>
+              <w:left w:val="single" w:color="CCCCCC" w:sz="4"/>
+              <w:bottom w:val="single" w:color="CCCCCC" w:sz="4"/>
+              <w:right w:val="single" w:color="CCCCCC" w:sz="4"/>
+            </w:tcBorders>
+            <w:shd w:fill="FFFFFF" w:val="clear"/>
+            <w:tcMar>
+              <w:top w:type="dxa" w:w="80"/>
+              <w:left w:type="dxa" w:w="120"/>
+              <w:bottom w:type="dxa" w:w="80"/>
+              <w:right w:type="dxa" w:w="120"/>
+            </w:tcMar>
+            <w:vAlign w:val="top"/>
+          </w:tcPr>
+          <w:p>
+            <w:pPr>
+              <w:spacing w:after="80" w:before="80"/>
+              <w:jc w:val="left"/>
+            </w:pPr>
+            <w:r>
+              <w:rPr>
+                <w:rFonts w:ascii="Arial" w:cs="Arial" w:eastAsia="Arial" w:hAnsi="Arial"/>
+                <w:b w:val="false"/>
+                <w:bCs w:val="false"/>
+                <w:sz w:val="22"/>
+                <w:szCs w:val="22"/>
+              </w:rPr>
+              <w:t xml:space="preserve">Knee valgus hallucination</w:t>
+            </w:r>
+          </w:p>
+        </w:tc>
+        <w:tc>
+          <w:tcPr>
+            <w:tcW w:type="dxa" w:w="3800"/>
+            <w:tcBorders>
+              <w:top w:val="single" w:color="CCCCCC" w:sz="4"/>
+              <w:left w:val="single" w:color="CCCCCC" w:sz="4"/>
+              <w:bottom w:val="single" w:color="CCCCCC" w:sz="4"/>
+              <w:right w:val="single" w:color="CCCCCC" w:sz="4"/>
+            </w:tcBorders>
+            <w:shd w:fill="FFFFFF" w:val="clear"/>
+            <w:tcMar>
+              <w:top w:type="dxa" w:w="80"/>
+              <w:left w:type="dxa" w:w="120"/>
+              <w:bottom w:type="dxa" w:w="80"/>
+              <w:right w:type="dxa" w:w="120"/>
+            </w:tcMar>
+            <w:vAlign w:val="top"/>
+          </w:tcPr>
+          <w:p>
+            <w:pPr>
+              <w:spacing w:after="80" w:before="80"/>
+              <w:jc w:val="left"/>
+            </w:pPr>
+            <w:r>
+              <w:rPr>
+                <w:rFonts w:ascii="Arial" w:cs="Arial" w:eastAsia="Arial" w:hAnsi="Arial"/>
+                <w:b w:val="false"/>
+                <w:bCs w:val="false"/>
+                <w:sz w:val="22"/>
+                <w:szCs w:val="22"/>
+              </w:rPr>
+              <w:t xml:space="preserve">The AI claims knee valgus (inward collapse), knee varus, elbow flare, grip width, or stance width. None of these are measurable from the side-view camera.</w:t>
+            </w:r>
+          </w:p>
+        </w:tc>
+        <w:tc>
+          <w:tcPr>
+            <w:tcW w:type="dxa" w:w="3360"/>
+            <w:tcBorders>
+              <w:top w:val="single" w:color="CCCCCC" w:sz="4"/>
+              <w:left w:val="single" w:color="CCCCCC" w:sz="4"/>
+              <w:bottom w:val="single" w:color="CCCCCC" w:sz="4"/>
+              <w:right w:val="single" w:color="CCCCCC" w:sz="4"/>
+            </w:tcBorders>
+            <w:shd w:fill="FFFFFF" w:val="clear"/>
+            <w:tcMar>
+              <w:top w:type="dxa" w:w="80"/>
+              <w:left w:type="dxa" w:w="120"/>
+              <w:bottom w:type="dxa" w:w="80"/>
+              <w:right w:type="dxa" w:w="120"/>
+            </w:tcMar>
+            <w:vAlign w:val="top"/>
+          </w:tcPr>
+          <w:p>
+            <w:pPr>
+              <w:spacing w:after="80" w:before="80"/>
+              <w:jc w:val="left"/>
+            </w:pPr>
+            <w:r>
+              <w:rPr>
+                <w:rFonts w:ascii="Arial" w:cs="Arial" w:eastAsia="Arial" w:hAnsi="Arial"/>
+                <w:b w:val="false"/>
+                <w:bCs w:val="false"/>
+                <w:sz w:val="22"/>
+                <w:szCs w:val="22"/>
+              </w:rPr>
+              <w:t xml:space="preserve">Flag as false positive using "AI identified a non-issue". This is the most common AI error.</w:t>
+            </w:r>
+          </w:p>
+        </w:tc>
+      </w:tr>
+      <w:tr>
+        <w:tc>
+          <w:tcPr>
+            <w:tcW w:type="dxa" w:w="2200"/>
+            <w:tcBorders>
+              <w:top w:val="single" w:color="CCCCCC" w:sz="4"/>
+              <w:left w:val="single" w:color="CCCCCC" w:sz="4"/>
+              <w:bottom w:val="single" w:color="CCCCCC" w:sz="4"/>
+              <w:right w:val="single" w:color="CCCCCC" w:sz="4"/>
+            </w:tcBorders>
+            <w:shd w:fill="F2F2F2" w:val="clear"/>
+            <w:tcMar>
+              <w:top w:type="dxa" w:w="80"/>
+              <w:left w:type="dxa" w:w="120"/>
+              <w:bottom w:type="dxa" w:w="80"/>
+              <w:right w:type="dxa" w:w="120"/>
+            </w:tcMar>
+            <w:vAlign w:val="top"/>
+          </w:tcPr>
+          <w:p>
+            <w:pPr>
+              <w:spacing w:after="80" w:before="80"/>
+              <w:jc w:val="left"/>
+            </w:pPr>
+            <w:r>
+              <w:rPr>
+                <w:rFonts w:ascii="Arial" w:cs="Arial" w:eastAsia="Arial" w:hAnsi="Arial"/>
+                <w:b w:val="false"/>
+                <w:bCs w:val="false"/>
+                <w:sz w:val="22"/>
+                <w:szCs w:val="22"/>
+              </w:rPr>
+              <w:t xml:space="preserve">Generic coaching cues</w:t>
+            </w:r>
+          </w:p>
+        </w:tc>
+        <w:tc>
+          <w:tcPr>
+            <w:tcW w:type="dxa" w:w="3800"/>
+            <w:tcBorders>
+              <w:top w:val="single" w:color="CCCCCC" w:sz="4"/>
+              <w:left w:val="single" w:color="CCCCCC" w:sz="4"/>
+              <w:bottom w:val="single" w:color="CCCCCC" w:sz="4"/>
+              <w:right w:val="single" w:color="CCCCCC" w:sz="4"/>
+            </w:tcBorders>
+            <w:shd w:fill="F2F2F2" w:val="clear"/>
+            <w:tcMar>
+              <w:top w:type="dxa" w:w="80"/>
+              <w:left w:type="dxa" w:w="120"/>
+              <w:bottom w:type="dxa" w:w="80"/>
+              <w:right w:type="dxa" w:w="120"/>
+            </w:tcMar>
+            <w:vAlign w:val="top"/>
+          </w:tcPr>
+          <w:p>
+            <w:pPr>
+              <w:spacing w:after="80" w:before="80"/>
+              <w:jc w:val="left"/>
+            </w:pPr>
+            <w:r>
+              <w:rPr>
+                <w:rFonts w:ascii="Arial" w:cs="Arial" w:eastAsia="Arial" w:hAnsi="Arial"/>
+                <w:b w:val="false"/>
+                <w:bCs w:val="false"/>
+                <w:sz w:val="22"/>
+                <w:szCs w:val="22"/>
+              </w:rPr>
+              <w:t xml:space="preserve">Vague advice like "maintain good form" or "keep your core tight" without specifying which rep, which joint, or what to change.</w:t>
+            </w:r>
+          </w:p>
+        </w:tc>
+        <w:tc>
+          <w:tcPr>
+            <w:tcW w:type="dxa" w:w="3360"/>
+            <w:tcBorders>
+              <w:top w:val="single" w:color="CCCCCC" w:sz="4"/>
+              <w:left w:val="single" w:color="CCCCCC" w:sz="4"/>
+              <w:bottom w:val="single" w:color="CCCCCC" w:sz="4"/>
+              <w:right w:val="single" w:color="CCCCCC" w:sz="4"/>
+            </w:tcBorders>
+            <w:shd w:fill="F2F2F2" w:val="clear"/>
+            <w:tcMar>
+              <w:top w:type="dxa" w:w="80"/>
+              <w:left w:type="dxa" w:w="120"/>
+              <w:bottom w:type="dxa" w:w="80"/>
+              <w:right w:type="dxa" w:w="120"/>
+            </w:tcMar>
+            <w:vAlign w:val="top"/>
+          </w:tcPr>
+          <w:p>
+            <w:pPr>
+              <w:spacing w:after="80" w:before="80"/>
+              <w:jc w:val="left"/>
+            </w:pPr>
+            <w:r>
+              <w:rPr>
+                <w:rFonts w:ascii="Arial" w:cs="Arial" w:eastAsia="Arial" w:hAnsi="Arial"/>
+                <w:b w:val="false"/>
+                <w:bCs w:val="false"/>
+                <w:sz w:val="22"/>
+                <w:szCs w:val="22"/>
+              </w:rPr>
+              <w:t xml:space="preserve">Lower the Coaching Quality Score. Note in Suggested Corrections that cues should reference specific reps and joints.</w:t>
+            </w:r>
+          </w:p>
+        </w:tc>
+      </w:tr>
+      <w:tr>
+        <w:tc>
+          <w:tcPr>
+            <w:tcW w:type="dxa" w:w="2200"/>
+            <w:tcBorders>
+              <w:top w:val="single" w:color="CCCCCC" w:sz="4"/>
+              <w:left w:val="single" w:color="CCCCCC" w:sz="4"/>
+              <w:bottom w:val="single" w:color="CCCCCC" w:sz="4"/>
+              <w:right w:val="single" w:color="CCCCCC" w:sz="4"/>
+            </w:tcBorders>
+            <w:shd w:fill="FFFFFF" w:val="clear"/>
+            <w:tcMar>
+              <w:top w:type="dxa" w:w="80"/>
+              <w:left w:type="dxa" w:w="120"/>
+              <w:bottom w:type="dxa" w:w="80"/>
+              <w:right w:type="dxa" w:w="120"/>
+            </w:tcMar>
+            <w:vAlign w:val="top"/>
+          </w:tcPr>
+          <w:p>
+            <w:pPr>
+              <w:spacing w:after="80" w:before="80"/>
+              <w:jc w:val="left"/>
+            </w:pPr>
+            <w:r>
+              <w:rPr>
+                <w:rFonts w:ascii="Arial" w:cs="Arial" w:eastAsia="Arial" w:hAnsi="Arial"/>
+                <w:b w:val="false"/>
+                <w:bCs w:val="false"/>
+                <w:sz w:val="22"/>
+                <w:szCs w:val="22"/>
+              </w:rPr>
+              <w:t xml:space="preserve">Missing inline citation markers</w:t>
+            </w:r>
+          </w:p>
+        </w:tc>
+        <w:tc>
+          <w:tcPr>
+            <w:tcW w:type="dxa" w:w="3800"/>
+            <w:tcBorders>
+              <w:top w:val="single" w:color="CCCCCC" w:sz="4"/>
+              <w:left w:val="single" w:color="CCCCCC" w:sz="4"/>
+              <w:bottom w:val="single" w:color="CCCCCC" w:sz="4"/>
+              <w:right w:val="single" w:color="CCCCCC" w:sz="4"/>
+            </w:tcBorders>
+            <w:shd w:fill="FFFFFF" w:val="clear"/>
+            <w:tcMar>
+              <w:top w:type="dxa" w:w="80"/>
+              <w:left w:type="dxa" w:w="120"/>
+              <w:bottom w:type="dxa" w:w="80"/>
+              <w:right w:type="dxa" w:w="120"/>
+            </w:tcMar>
+            <w:vAlign w:val="top"/>
+          </w:tcPr>
+          <w:p>
+            <w:pPr>
+              <w:spacing w:after="80" w:before="80"/>
+              <w:jc w:val="left"/>
+            </w:pPr>
+            <w:r>
+              <w:rPr>
+                <w:rFonts w:ascii="Arial" w:cs="Arial" w:eastAsia="Arial" w:hAnsi="Arial"/>
+                <w:b w:val="false"/>
+                <w:bCs w:val="false"/>
+                <w:sz w:val="22"/>
+                <w:szCs w:val="22"/>
+              </w:rPr>
+              <w:t xml:space="preserve">Citations listed at the bottom but no [1], [2] markers in the coaching text. Markers must appear inline where claims are made.</w:t>
+            </w:r>
+          </w:p>
+        </w:tc>
+        <w:tc>
+          <w:tcPr>
+            <w:tcW w:type="dxa" w:w="3360"/>
+            <w:tcBorders>
+              <w:top w:val="single" w:color="CCCCCC" w:sz="4"/>
+              <w:left w:val="single" w:color="CCCCCC" w:sz="4"/>
+              <w:bottom w:val="single" w:color="CCCCCC" w:sz="4"/>
+              <w:right w:val="single" w:color="CCCCCC" w:sz="4"/>
+            </w:tcBorders>
+            <w:shd w:fill="FFFFFF" w:val="clear"/>
+            <w:tcMar>
+              <w:top w:type="dxa" w:w="80"/>
+              <w:left w:type="dxa" w:w="120"/>
+              <w:bottom w:type="dxa" w:w="80"/>
+              <w:right w:type="dxa" w:w="120"/>
+            </w:tcMar>
+            <w:vAlign w:val="top"/>
+          </w:tcPr>
+          <w:p>
+            <w:pPr>
+              <w:spacing w:after="80" w:before="80"/>
+              <w:jc w:val="left"/>
+            </w:pPr>
+            <w:r>
+              <w:rPr>
+                <w:rFonts w:ascii="Arial" w:cs="Arial" w:eastAsia="Arial" w:hAnsi="Arial"/>
+                <w:b w:val="false"/>
+                <w:bCs w:val="false"/>
+                <w:sz w:val="22"/>
+                <w:szCs w:val="22"/>
+              </w:rPr>
+              <w:t xml:space="preserve">Flag as a quality issue. Citations without inline markers don't help the user trace claims to evidence.</w:t>
+            </w:r>
+          </w:p>
+        </w:tc>
+      </w:tr>
+      <w:tr>
+        <w:tc>
+          <w:tcPr>
+            <w:tcW w:type="dxa" w:w="2200"/>
+            <w:tcBorders>
+              <w:top w:val="single" w:color="CCCCCC" w:sz="4"/>
+              <w:left w:val="single" w:color="CCCCCC" w:sz="4"/>
+              <w:bottom w:val="single" w:color="CCCCCC" w:sz="4"/>
+              <w:right w:val="single" w:color="CCCCCC" w:sz="4"/>
+            </w:tcBorders>
+            <w:shd w:fill="F2F2F2" w:val="clear"/>
+            <w:tcMar>
+              <w:top w:type="dxa" w:w="80"/>
+              <w:left w:type="dxa" w:w="120"/>
+              <w:bottom w:type="dxa" w:w="80"/>
+              <w:right w:type="dxa" w:w="120"/>
+            </w:tcMar>
+            <w:vAlign w:val="top"/>
+          </w:tcPr>
+          <w:p>
+            <w:pPr>
+              <w:spacing w:after="80" w:before="80"/>
+              <w:jc w:val="left"/>
+            </w:pPr>
+            <w:r>
+              <w:rPr>
+                <w:rFonts w:ascii="Arial" w:cs="Arial" w:eastAsia="Arial" w:hAnsi="Arial"/>
+                <w:b w:val="false"/>
+                <w:bCs w:val="false"/>
+                <w:sz w:val="22"/>
+                <w:szCs w:val="22"/>
+              </w:rPr>
+              <w:t xml:space="preserve">Unsupported claims (red faithfulness)</w:t>
+            </w:r>
+          </w:p>
+        </w:tc>
+        <w:tc>
+          <w:tcPr>
+            <w:tcW w:type="dxa" w:w="3800"/>
+            <w:tcBorders>
+              <w:top w:val="single" w:color="CCCCCC" w:sz="4"/>
+              <w:left w:val="single" w:color="CCCCCC" w:sz="4"/>
+              <w:bottom w:val="single" w:color="CCCCCC" w:sz="4"/>
+              <w:right w:val="single" w:color="CCCCCC" w:sz="4"/>
+            </w:tcBorders>
+            <w:shd w:fill="F2F2F2" w:val="clear"/>
+            <w:tcMar>
+              <w:top w:type="dxa" w:w="80"/>
+              <w:left w:type="dxa" w:w="120"/>
+              <w:bottom w:type="dxa" w:w="80"/>
+              <w:right w:type="dxa" w:w="120"/>
+            </w:tcMar>
+            <w:vAlign w:val="top"/>
+          </w:tcPr>
+          <w:p>
+            <w:pPr>
+              <w:spacing w:after="80" w:before="80"/>
+              <w:jc w:val="left"/>
+            </w:pPr>
+            <w:r>
+              <w:rPr>
+                <w:rFonts w:ascii="Arial" w:cs="Arial" w:eastAsia="Arial" w:hAnsi="Arial"/>
+                <w:b w:val="false"/>
+                <w:bCs w:val="false"/>
+                <w:sz w:val="22"/>
+                <w:szCs w:val="22"/>
+              </w:rPr>
+              <w:t xml:space="preserve">Faithfulness eval score is red (below 80%). Some coaching claims are not backed by cited papers. Coaching is NOT suppressed — user sees it as-is.</w:t>
+            </w:r>
+          </w:p>
+        </w:tc>
+        <w:tc>
+          <w:tcPr>
+            <w:tcW w:type="dxa" w:w="3360"/>
+            <w:tcBorders>
+              <w:top w:val="single" w:color="CCCCCC" w:sz="4"/>
+              <w:left w:val="single" w:color="CCCCCC" w:sz="4"/>
+              <w:bottom w:val="single" w:color="CCCCCC" w:sz="4"/>
+              <w:right w:val="single" w:color="CCCCCC" w:sz="4"/>
+            </w:tcBorders>
+            <w:shd w:fill="F2F2F2" w:val="clear"/>
+            <w:tcMar>
+              <w:top w:type="dxa" w:w="80"/>
+              <w:left w:type="dxa" w:w="120"/>
+              <w:bottom w:type="dxa" w:w="80"/>
+              <w:right w:type="dxa" w:w="120"/>
+            </w:tcMar>
+            <w:vAlign w:val="top"/>
+          </w:tcPr>
+          <w:p>
+            <w:pPr>
+              <w:spacing w:after="80" w:before="80"/>
+              <w:jc w:val="left"/>
+            </w:pPr>
+            <w:r>
+              <w:rPr>
+                <w:rFonts w:ascii="Arial" w:cs="Arial" w:eastAsia="Arial" w:hAnsi="Arial"/>
+                <w:b w:val="false"/>
+                <w:bCs w:val="false"/>
+                <w:sz w:val="22"/>
+                <w:szCs w:val="22"/>
+              </w:rPr>
+              <w:t xml:space="preserve">Check each coaching claim against the cited papers. Flag specific unsupported claims using issue checkboxes and free-text fields.</w:t>
+            </w:r>
+          </w:p>
+        </w:tc>
+      </w:tr>
+      <w:tr>
+        <w:tc>
+          <w:tcPr>
+            <w:tcW w:type="dxa" w:w="2200"/>
+            <w:tcBorders>
+              <w:top w:val="single" w:color="CCCCCC" w:sz="4"/>
+              <w:left w:val="single" w:color="CCCCCC" w:sz="4"/>
+              <w:bottom w:val="single" w:color="CCCCCC" w:sz="4"/>
+              <w:right w:val="single" w:color="CCCCCC" w:sz="4"/>
+            </w:tcBorders>
+            <w:shd w:fill="FFFFFF" w:val="clear"/>
+            <w:tcMar>
+              <w:top w:type="dxa" w:w="80"/>
+              <w:left w:type="dxa" w:w="120"/>
+              <w:bottom w:type="dxa" w:w="80"/>
+              <w:right w:type="dxa" w:w="120"/>
+            </w:tcMar>
+            <w:vAlign w:val="top"/>
+          </w:tcPr>
+          <w:p>
+            <w:pPr>
+              <w:spacing w:after="80" w:before="80"/>
+              <w:jc w:val="left"/>
+            </w:pPr>
+            <w:r>
+              <w:rPr>
+                <w:rFonts w:ascii="Arial" w:cs="Arial" w:eastAsia="Arial" w:hAnsi="Arial"/>
+                <w:b w:val="false"/>
+                <w:bCs w:val="false"/>
+                <w:sz w:val="22"/>
+                <w:szCs w:val="22"/>
+              </w:rPr>
+              <w:t xml:space="preserve">Severity misordering</w:t>
+            </w:r>
+          </w:p>
+        </w:tc>
+        <w:tc>
+          <w:tcPr>
+            <w:tcW w:type="dxa" w:w="3800"/>
+            <w:tcBorders>
+              <w:top w:val="single" w:color="CCCCCC" w:sz="4"/>
+              <w:left w:val="single" w:color="CCCCCC" w:sz="4"/>
+              <w:bottom w:val="single" w:color="CCCCCC" w:sz="4"/>
+              <w:right w:val="single" w:color="CCCCCC" w:sz="4"/>
+            </w:tcBorders>
+            <w:shd w:fill="FFFFFF" w:val="clear"/>
+            <w:tcMar>
+              <w:top w:type="dxa" w:w="80"/>
+              <w:left w:type="dxa" w:w="120"/>
+              <w:bottom w:type="dxa" w:w="80"/>
+              <w:right w:type="dxa" w:w="120"/>
+            </w:tcMar>
+            <w:vAlign w:val="top"/>
+          </w:tcPr>
+          <w:p>
+            <w:pPr>
+              <w:spacing w:after="80" w:before="80"/>
+              <w:jc w:val="left"/>
+            </w:pPr>
+            <w:r>
+              <w:rPr>
+                <w:rFonts w:ascii="Arial" w:cs="Arial" w:eastAsia="Arial" w:hAnsi="Arial"/>
+                <w:b w:val="false"/>
+                <w:bCs w:val="false"/>
+                <w:sz w:val="22"/>
+                <w:szCs w:val="22"/>
+              </w:rPr>
+              <w:t xml:space="preserve">A Medium or Low severity issue appears before a High severity issue. High-severity issues should be listed first.</w:t>
+            </w:r>
+          </w:p>
+        </w:tc>
+        <w:tc>
+          <w:tcPr>
+            <w:tcW w:type="dxa" w:w="3360"/>
+            <w:tcBorders>
+              <w:top w:val="single" w:color="CCCCCC" w:sz="4"/>
+              <w:left w:val="single" w:color="CCCCCC" w:sz="4"/>
+              <w:bottom w:val="single" w:color="CCCCCC" w:sz="4"/>
+              <w:right w:val="single" w:color="CCCCCC" w:sz="4"/>
+            </w:tcBorders>
+            <w:shd w:fill="FFFFFF" w:val="clear"/>
+            <w:tcMar>
+              <w:top w:type="dxa" w:w="80"/>
+              <w:left w:type="dxa" w:w="120"/>
+              <w:bottom w:type="dxa" w:w="80"/>
+              <w:right w:type="dxa" w:w="120"/>
+            </w:tcMar>
+            <w:vAlign w:val="top"/>
+          </w:tcPr>
+          <w:p>
+            <w:pPr>
+              <w:spacing w:after="80" w:before="80"/>
+              <w:jc w:val="left"/>
+            </w:pPr>
+            <w:r>
+              <w:rPr>
+                <w:rFonts w:ascii="Arial" w:cs="Arial" w:eastAsia="Arial" w:hAnsi="Arial"/>
+                <w:b w:val="false"/>
+                <w:bCs w:val="false"/>
+                <w:sz w:val="22"/>
+                <w:szCs w:val="22"/>
+              </w:rPr>
+              <w:t xml:space="preserve">Note in Suggested Corrections that issues should be reordered by severity.</w:t>
+            </w:r>
+          </w:p>
+        </w:tc>
+      </w:tr>
+      <w:tr>
+        <w:tc>
+          <w:tcPr>
+            <w:tcW w:type="dxa" w:w="2200"/>
+            <w:tcBorders>
+              <w:top w:val="single" w:color="CCCCCC" w:sz="4"/>
+              <w:left w:val="single" w:color="CCCCCC" w:sz="4"/>
+              <w:bottom w:val="single" w:color="CCCCCC" w:sz="4"/>
+              <w:right w:val="single" w:color="CCCCCC" w:sz="4"/>
+            </w:tcBorders>
+            <w:shd w:fill="F2F2F2" w:val="clear"/>
+            <w:tcMar>
+              <w:top w:type="dxa" w:w="80"/>
+              <w:left w:type="dxa" w:w="120"/>
+              <w:bottom w:type="dxa" w:w="80"/>
+              <w:right w:type="dxa" w:w="120"/>
+            </w:tcMar>
+            <w:vAlign w:val="top"/>
+          </w:tcPr>
+          <w:p>
+            <w:pPr>
+              <w:spacing w:after="80" w:before="80"/>
+              <w:jc w:val="left"/>
+            </w:pPr>
+            <w:r>
+              <w:rPr>
+                <w:rFonts w:ascii="Arial" w:cs="Arial" w:eastAsia="Arial" w:hAnsi="Arial"/>
+                <w:b w:val="false"/>
+                <w:bCs w:val="false"/>
+                <w:sz w:val="22"/>
+                <w:szCs w:val="22"/>
+              </w:rPr>
+              <w:t xml:space="preserve">Prohibited language</w:t>
+            </w:r>
+          </w:p>
+        </w:tc>
+        <w:tc>
+          <w:tcPr>
+            <w:tcW w:type="dxa" w:w="3800"/>
+            <w:tcBorders>
+              <w:top w:val="single" w:color="CCCCCC" w:sz="4"/>
+              <w:left w:val="single" w:color="CCCCCC" w:sz="4"/>
+              <w:bottom w:val="single" w:color="CCCCCC" w:sz="4"/>
+              <w:right w:val="single" w:color="CCCCCC" w:sz="4"/>
+            </w:tcBorders>
+            <w:shd w:fill="F2F2F2" w:val="clear"/>
+            <w:tcMar>
+              <w:top w:type="dxa" w:w="80"/>
+              <w:left w:type="dxa" w:w="120"/>
+              <w:bottom w:type="dxa" w:w="80"/>
+              <w:right w:type="dxa" w:w="120"/>
+            </w:tcMar>
+            <w:vAlign w:val="top"/>
+          </w:tcPr>
+          <w:p>
+            <w:pPr>
+              <w:spacing w:after="80" w:before="80"/>
+              <w:jc w:val="left"/>
+            </w:pPr>
+            <w:r>
+              <w:rPr>
+                <w:rFonts w:ascii="Arial" w:cs="Arial" w:eastAsia="Arial" w:hAnsi="Arial"/>
+                <w:b w:val="false"/>
+                <w:bCs w:val="false"/>
+                <w:sz w:val="22"/>
+                <w:szCs w:val="22"/>
+              </w:rPr>
+              <w:t xml:space="preserve">Terms like "injury risk", "injury prevention", "diagnose", "treatment", or "clinical" in the coaching text.</w:t>
+            </w:r>
+          </w:p>
+        </w:tc>
+        <w:tc>
+          <w:tcPr>
+            <w:tcW w:type="dxa" w:w="3360"/>
+            <w:tcBorders>
+              <w:top w:val="single" w:color="CCCCCC" w:sz="4"/>
+              <w:left w:val="single" w:color="CCCCCC" w:sz="4"/>
+              <w:bottom w:val="single" w:color="CCCCCC" w:sz="4"/>
+              <w:right w:val="single" w:color="CCCCCC" w:sz="4"/>
+            </w:tcBorders>
+            <w:shd w:fill="F2F2F2" w:val="clear"/>
+            <w:tcMar>
+              <w:top w:type="dxa" w:w="80"/>
+              <w:left w:type="dxa" w:w="120"/>
+              <w:bottom w:type="dxa" w:w="80"/>
+              <w:right w:type="dxa" w:w="120"/>
+            </w:tcMar>
+            <w:vAlign w:val="top"/>
+          </w:tcPr>
+          <w:p>
+            <w:pPr>
+              <w:spacing w:after="80" w:before="80"/>
+              <w:jc w:val="left"/>
+            </w:pPr>
+            <w:r>
+              <w:rPr>
+                <w:rFonts w:ascii="Arial" w:cs="Arial" w:eastAsia="Arial" w:hAnsi="Arial"/>
+                <w:b w:val="false"/>
+                <w:bCs w:val="false"/>
+                <w:sz w:val="22"/>
+                <w:szCs w:val="22"/>
+              </w:rPr>
+              <w:t xml:space="preserve">Flag using "AI identified a non-issue" and note the prohibited term. See Section 8.</w:t>
+            </w:r>
+          </w:p>
+        </w:tc>
+      </w:tr>
+      <w:tr>
+        <w:tc>
+          <w:tcPr>
+            <w:tcW w:type="dxa" w:w="2200"/>
+            <w:tcBorders>
+              <w:top w:val="single" w:color="CCCCCC" w:sz="4"/>
+              <w:left w:val="single" w:color="CCCCCC" w:sz="4"/>
+              <w:bottom w:val="single" w:color="CCCCCC" w:sz="4"/>
+              <w:right w:val="single" w:color="CCCCCC" w:sz="4"/>
+            </w:tcBorders>
+            <w:shd w:fill="FFFFFF" w:val="clear"/>
+            <w:tcMar>
+              <w:top w:type="dxa" w:w="80"/>
+              <w:left w:type="dxa" w:w="120"/>
+              <w:bottom w:type="dxa" w:w="80"/>
+              <w:right w:type="dxa" w:w="120"/>
+            </w:tcMar>
+            <w:vAlign w:val="top"/>
+          </w:tcPr>
+          <w:p>
+            <w:pPr>
+              <w:spacing w:after="80" w:before="80"/>
+              <w:jc w:val="left"/>
+            </w:pPr>
+            <w:r>
+              <w:rPr>
+                <w:rFonts w:ascii="Arial" w:cs="Arial" w:eastAsia="Arial" w:hAnsi="Arial"/>
+                <w:b w:val="false"/>
+                <w:bCs w:val="false"/>
+                <w:sz w:val="22"/>
+                <w:szCs w:val="22"/>
+              </w:rPr>
+              <w:t xml:space="preserve">Overclaiming depth issues</w:t>
+            </w:r>
+          </w:p>
+        </w:tc>
+        <w:tc>
+          <w:tcPr>
+            <w:tcW w:type="dxa" w:w="3800"/>
+            <w:tcBorders>
+              <w:top w:val="single" w:color="CCCCCC" w:sz="4"/>
+              <w:left w:val="single" w:color="CCCCCC" w:sz="4"/>
+              <w:bottom w:val="single" w:color="CCCCCC" w:sz="4"/>
+              <w:right w:val="single" w:color="CCCCCC" w:sz="4"/>
+            </w:tcBorders>
+            <w:shd w:fill="FFFFFF" w:val="clear"/>
+            <w:tcMar>
+              <w:top w:type="dxa" w:w="80"/>
+              <w:left w:type="dxa" w:w="120"/>
+              <w:bottom w:type="dxa" w:w="80"/>
+              <w:right w:type="dxa" w:w="120"/>
+            </w:tcMar>
+            <w:vAlign w:val="top"/>
+          </w:tcPr>
+          <w:p>
+            <w:pPr>
+              <w:spacing w:after="80" w:before="80"/>
+              <w:jc w:val="left"/>
+            </w:pPr>
+            <w:r>
+              <w:rPr>
+                <w:rFonts w:ascii="Arial" w:cs="Arial" w:eastAsia="Arial" w:hAnsi="Arial"/>
+                <w:b w:val="false"/>
+                <w:bCs w:val="false"/>
+                <w:sz w:val="22"/>
+                <w:szCs w:val="22"/>
+              </w:rPr>
+              <w:t xml:space="preserve">AI flags depth as insufficient when score cards show depth angle at or below 90° (parallel).</w:t>
+            </w:r>
+          </w:p>
+        </w:tc>
+        <w:tc>
+          <w:tcPr>
+            <w:tcW w:type="dxa" w:w="3360"/>
+            <w:tcBorders>
+              <w:top w:val="single" w:color="CCCCCC" w:sz="4"/>
+              <w:left w:val="single" w:color="CCCCCC" w:sz="4"/>
+              <w:bottom w:val="single" w:color="CCCCCC" w:sz="4"/>
+              <w:right w:val="single" w:color="CCCCCC" w:sz="4"/>
+            </w:tcBorders>
+            <w:shd w:fill="FFFFFF" w:val="clear"/>
+            <w:tcMar>
+              <w:top w:type="dxa" w:w="80"/>
+              <w:left w:type="dxa" w:w="120"/>
+              <w:bottom w:type="dxa" w:w="80"/>
+              <w:right w:type="dxa" w:w="120"/>
+            </w:tcMar>
+            <w:vAlign w:val="top"/>
+          </w:tcPr>
+          <w:p>
+            <w:pPr>
+              <w:spacing w:after="80" w:before="80"/>
+              <w:jc w:val="left"/>
+            </w:pPr>
+            <w:r>
+              <w:rPr>
+                <w:rFonts w:ascii="Arial" w:cs="Arial" w:eastAsia="Arial" w:hAnsi="Arial"/>
+                <w:b w:val="false"/>
+                <w:bCs w:val="false"/>
+                <w:sz w:val="22"/>
+                <w:szCs w:val="22"/>
+              </w:rPr>
+              <w:t xml:space="preserve">Cross-reference depth angle in rep metrics against the coaching claim. If numbers contradict, flag it.</w:t>
+            </w:r>
+          </w:p>
+        </w:tc>
+      </w:tr>
+    </w:tbl>
+    <w:p>
+      <w:r>
+        <w:br w:type="page"/>
       </w:r>
     </w:p>
     <w:p>
@@ -5278,12 +6163,12 @@
           <w:sz w:val="26"/>
           <w:szCs w:val="26"/>
         </w:rPr>
-        <w:t xml:space="preserve">4.4  Your Annotation Form</w:t>
-      </w:r>
-    </w:p>
-    <w:p>
-      <w:pPr>
-        <w:spacing w:after="80" w:before="60"/>
+        <w:t xml:space="preserve">4.4  What Good vs Bad Coaching Looks Like</w:t>
+      </w:r>
+    </w:p>
+    <w:p>
+      <w:pPr>
+        <w:spacing w:after="60" w:before="60"/>
         <w:jc w:val="left"/>
       </w:pPr>
       <w:r>
@@ -5294,7 +6179,722 @@
           <w:sz w:val="22"/>
           <w:szCs w:val="22"/>
         </w:rPr>
-        <w:t xml:space="preserve">Complete all relevant fields and click Submit.</w:t>
+        <w:t xml:space="preserve">Use these examples to calibrate your quality judgments. A Coaching Quality Score of 8+ should match the "good" column; a score below 5 should match the "bad" column.</w:t>
+      </w:r>
+    </w:p>
+    <w:tbl>
+      <w:tblPr>
+        <w:tblW w:type="dxa" w:w="9360"/>
+        <w:tblBorders>
+          <w:top w:val="single" w:color="auto" w:sz="4"/>
+          <w:left w:val="single" w:color="auto" w:sz="4"/>
+          <w:bottom w:val="single" w:color="auto" w:sz="4"/>
+          <w:right w:val="single" w:color="auto" w:sz="4"/>
+          <w:insideH w:val="single" w:color="auto" w:sz="4"/>
+          <w:insideV w:val="single" w:color="auto" w:sz="4"/>
+        </w:tblBorders>
+      </w:tblPr>
+      <w:tblGrid>
+        <w:gridCol w:w="1400"/>
+        <w:gridCol w:w="4200"/>
+        <w:gridCol w:w="3760"/>
+      </w:tblGrid>
+      <w:tr>
+        <w:trPr>
+          <w:tblHeader/>
+        </w:trPr>
+        <w:tc>
+          <w:tcPr>
+            <w:tcW w:type="dxa" w:w="1400"/>
+            <w:tcBorders>
+              <w:top w:val="single" w:color="CCCCCC" w:sz="4"/>
+              <w:left w:val="single" w:color="CCCCCC" w:sz="4"/>
+              <w:bottom w:val="single" w:color="CCCCCC" w:sz="4"/>
+              <w:right w:val="single" w:color="CCCCCC" w:sz="4"/>
+            </w:tcBorders>
+            <w:shd w:fill="2E75B6" w:val="clear"/>
+            <w:tcMar>
+              <w:top w:type="dxa" w:w="80"/>
+              <w:left w:type="dxa" w:w="120"/>
+              <w:bottom w:type="dxa" w:w="80"/>
+              <w:right w:type="dxa" w:w="120"/>
+            </w:tcMar>
+            <w:vAlign w:val="top"/>
+          </w:tcPr>
+          <w:p>
+            <w:pPr>
+              <w:spacing w:after="80" w:before="80"/>
+              <w:jc w:val="left"/>
+            </w:pPr>
+            <w:r>
+              <w:rPr>
+                <w:rFonts w:ascii="Arial" w:cs="Arial" w:eastAsia="Arial" w:hAnsi="Arial"/>
+                <w:b/>
+                <w:bCs/>
+                <w:color w:val="FFFFFF"/>
+                <w:sz w:val="22"/>
+                <w:szCs w:val="22"/>
+              </w:rPr>
+              <w:t xml:space="preserve">Aspect</w:t>
+            </w:r>
+          </w:p>
+        </w:tc>
+        <w:tc>
+          <w:tcPr>
+            <w:tcW w:type="dxa" w:w="4200"/>
+            <w:tcBorders>
+              <w:top w:val="single" w:color="CCCCCC" w:sz="4"/>
+              <w:left w:val="single" w:color="CCCCCC" w:sz="4"/>
+              <w:bottom w:val="single" w:color="CCCCCC" w:sz="4"/>
+              <w:right w:val="single" w:color="CCCCCC" w:sz="4"/>
+            </w:tcBorders>
+            <w:shd w:fill="2E75B6" w:val="clear"/>
+            <w:tcMar>
+              <w:top w:type="dxa" w:w="80"/>
+              <w:left w:type="dxa" w:w="120"/>
+              <w:bottom w:type="dxa" w:w="80"/>
+              <w:right w:type="dxa" w:w="120"/>
+            </w:tcMar>
+            <w:vAlign w:val="top"/>
+          </w:tcPr>
+          <w:p>
+            <w:pPr>
+              <w:spacing w:after="80" w:before="80"/>
+              <w:jc w:val="left"/>
+            </w:pPr>
+            <w:r>
+              <w:rPr>
+                <w:rFonts w:ascii="Arial" w:cs="Arial" w:eastAsia="Arial" w:hAnsi="Arial"/>
+                <w:b/>
+                <w:bCs/>
+                <w:color w:val="FFFFFF"/>
+                <w:sz w:val="22"/>
+                <w:szCs w:val="22"/>
+              </w:rPr>
+              <w:t xml:space="preserve">Good Coaching (score 8+)</w:t>
+            </w:r>
+          </w:p>
+        </w:tc>
+        <w:tc>
+          <w:tcPr>
+            <w:tcW w:type="dxa" w:w="3760"/>
+            <w:tcBorders>
+              <w:top w:val="single" w:color="CCCCCC" w:sz="4"/>
+              <w:left w:val="single" w:color="CCCCCC" w:sz="4"/>
+              <w:bottom w:val="single" w:color="CCCCCC" w:sz="4"/>
+              <w:right w:val="single" w:color="CCCCCC" w:sz="4"/>
+            </w:tcBorders>
+            <w:shd w:fill="2E75B6" w:val="clear"/>
+            <w:tcMar>
+              <w:top w:type="dxa" w:w="80"/>
+              <w:left w:type="dxa" w:w="120"/>
+              <w:bottom w:type="dxa" w:w="80"/>
+              <w:right w:type="dxa" w:w="120"/>
+            </w:tcMar>
+            <w:vAlign w:val="top"/>
+          </w:tcPr>
+          <w:p>
+            <w:pPr>
+              <w:spacing w:after="80" w:before="80"/>
+              <w:jc w:val="left"/>
+            </w:pPr>
+            <w:r>
+              <w:rPr>
+                <w:rFonts w:ascii="Arial" w:cs="Arial" w:eastAsia="Arial" w:hAnsi="Arial"/>
+                <w:b/>
+                <w:bCs/>
+                <w:color w:val="FFFFFF"/>
+                <w:sz w:val="22"/>
+                <w:szCs w:val="22"/>
+              </w:rPr>
+              <w:t xml:space="preserve">Bad Coaching (score &lt; 5)</w:t>
+            </w:r>
+          </w:p>
+        </w:tc>
+      </w:tr>
+      <w:tr>
+        <w:tc>
+          <w:tcPr>
+            <w:tcW w:type="dxa" w:w="1400"/>
+            <w:tcBorders>
+              <w:top w:val="single" w:color="CCCCCC" w:sz="4"/>
+              <w:left w:val="single" w:color="CCCCCC" w:sz="4"/>
+              <w:bottom w:val="single" w:color="CCCCCC" w:sz="4"/>
+              <w:right w:val="single" w:color="CCCCCC" w:sz="4"/>
+            </w:tcBorders>
+            <w:shd w:fill="FFFFFF" w:val="clear"/>
+            <w:tcMar>
+              <w:top w:type="dxa" w:w="80"/>
+              <w:left w:type="dxa" w:w="120"/>
+              <w:bottom w:type="dxa" w:w="80"/>
+              <w:right w:type="dxa" w:w="120"/>
+            </w:tcMar>
+            <w:vAlign w:val="top"/>
+          </w:tcPr>
+          <w:p>
+            <w:pPr>
+              <w:spacing w:after="80" w:before="80"/>
+              <w:jc w:val="left"/>
+            </w:pPr>
+            <w:r>
+              <w:rPr>
+                <w:rFonts w:ascii="Arial" w:cs="Arial" w:eastAsia="Arial" w:hAnsi="Arial"/>
+                <w:b w:val="false"/>
+                <w:bCs w:val="false"/>
+                <w:sz w:val="22"/>
+                <w:szCs w:val="22"/>
+              </w:rPr>
+              <w:t xml:space="preserve">Specificity</w:t>
+            </w:r>
+          </w:p>
+        </w:tc>
+        <w:tc>
+          <w:tcPr>
+            <w:tcW w:type="dxa" w:w="4200"/>
+            <w:tcBorders>
+              <w:top w:val="single" w:color="CCCCCC" w:sz="4"/>
+              <w:left w:val="single" w:color="CCCCCC" w:sz="4"/>
+              <w:bottom w:val="single" w:color="CCCCCC" w:sz="4"/>
+              <w:right w:val="single" w:color="CCCCCC" w:sz="4"/>
+            </w:tcBorders>
+            <w:shd w:fill="FFFFFF" w:val="clear"/>
+            <w:tcMar>
+              <w:top w:type="dxa" w:w="80"/>
+              <w:left w:type="dxa" w:w="120"/>
+              <w:bottom w:type="dxa" w:w="80"/>
+              <w:right w:type="dxa" w:w="120"/>
+            </w:tcMar>
+            <w:vAlign w:val="top"/>
+          </w:tcPr>
+          <w:p>
+            <w:pPr>
+              <w:spacing w:after="80" w:before="80"/>
+              <w:jc w:val="left"/>
+            </w:pPr>
+            <w:r>
+              <w:rPr>
+                <w:rFonts w:ascii="Arial" w:cs="Arial" w:eastAsia="Arial" w:hAnsi="Arial"/>
+                <w:b w:val="false"/>
+                <w:bCs w:val="false"/>
+                <w:sz w:val="22"/>
+                <w:szCs w:val="22"/>
+              </w:rPr>
+              <w:t xml:space="preserve">"On rep 3, your hip angle reached 95°. Drive your hips back further to break 90°."</w:t>
+            </w:r>
+          </w:p>
+        </w:tc>
+        <w:tc>
+          <w:tcPr>
+            <w:tcW w:type="dxa" w:w="3760"/>
+            <w:tcBorders>
+              <w:top w:val="single" w:color="CCCCCC" w:sz="4"/>
+              <w:left w:val="single" w:color="CCCCCC" w:sz="4"/>
+              <w:bottom w:val="single" w:color="CCCCCC" w:sz="4"/>
+              <w:right w:val="single" w:color="CCCCCC" w:sz="4"/>
+            </w:tcBorders>
+            <w:shd w:fill="FFFFFF" w:val="clear"/>
+            <w:tcMar>
+              <w:top w:type="dxa" w:w="80"/>
+              <w:left w:type="dxa" w:w="120"/>
+              <w:bottom w:type="dxa" w:w="80"/>
+              <w:right w:type="dxa" w:w="120"/>
+            </w:tcMar>
+            <w:vAlign w:val="top"/>
+          </w:tcPr>
+          <w:p>
+            <w:pPr>
+              <w:spacing w:after="80" w:before="80"/>
+              <w:jc w:val="left"/>
+            </w:pPr>
+            <w:r>
+              <w:rPr>
+                <w:rFonts w:ascii="Arial" w:cs="Arial" w:eastAsia="Arial" w:hAnsi="Arial"/>
+                <w:b w:val="false"/>
+                <w:bCs w:val="false"/>
+                <w:sz w:val="22"/>
+                <w:szCs w:val="22"/>
+              </w:rPr>
+              <w:t xml:space="preserve">"Try to go deeper on your squats."</w:t>
+            </w:r>
+          </w:p>
+        </w:tc>
+      </w:tr>
+      <w:tr>
+        <w:tc>
+          <w:tcPr>
+            <w:tcW w:type="dxa" w:w="1400"/>
+            <w:tcBorders>
+              <w:top w:val="single" w:color="CCCCCC" w:sz="4"/>
+              <w:left w:val="single" w:color="CCCCCC" w:sz="4"/>
+              <w:bottom w:val="single" w:color="CCCCCC" w:sz="4"/>
+              <w:right w:val="single" w:color="CCCCCC" w:sz="4"/>
+            </w:tcBorders>
+            <w:shd w:fill="F2F2F2" w:val="clear"/>
+            <w:tcMar>
+              <w:top w:type="dxa" w:w="80"/>
+              <w:left w:type="dxa" w:w="120"/>
+              <w:bottom w:type="dxa" w:w="80"/>
+              <w:right w:type="dxa" w:w="120"/>
+            </w:tcMar>
+            <w:vAlign w:val="top"/>
+          </w:tcPr>
+          <w:p>
+            <w:pPr>
+              <w:spacing w:after="80" w:before="80"/>
+              <w:jc w:val="left"/>
+            </w:pPr>
+            <w:r>
+              <w:rPr>
+                <w:rFonts w:ascii="Arial" w:cs="Arial" w:eastAsia="Arial" w:hAnsi="Arial"/>
+                <w:b w:val="false"/>
+                <w:bCs w:val="false"/>
+                <w:sz w:val="22"/>
+                <w:szCs w:val="22"/>
+              </w:rPr>
+              <w:t xml:space="preserve">Citation use</w:t>
+            </w:r>
+          </w:p>
+        </w:tc>
+        <w:tc>
+          <w:tcPr>
+            <w:tcW w:type="dxa" w:w="4200"/>
+            <w:tcBorders>
+              <w:top w:val="single" w:color="CCCCCC" w:sz="4"/>
+              <w:left w:val="single" w:color="CCCCCC" w:sz="4"/>
+              <w:bottom w:val="single" w:color="CCCCCC" w:sz="4"/>
+              <w:right w:val="single" w:color="CCCCCC" w:sz="4"/>
+            </w:tcBorders>
+            <w:shd w:fill="F2F2F2" w:val="clear"/>
+            <w:tcMar>
+              <w:top w:type="dxa" w:w="80"/>
+              <w:left w:type="dxa" w:w="120"/>
+              <w:bottom w:type="dxa" w:w="80"/>
+              <w:right w:type="dxa" w:w="120"/>
+            </w:tcMar>
+            <w:vAlign w:val="top"/>
+          </w:tcPr>
+          <w:p>
+            <w:pPr>
+              <w:spacing w:after="80" w:before="80"/>
+              <w:jc w:val="left"/>
+            </w:pPr>
+            <w:r>
+              <w:rPr>
+                <w:rFonts w:ascii="Arial" w:cs="Arial" w:eastAsia="Arial" w:hAnsi="Arial"/>
+                <w:b w:val="false"/>
+                <w:bCs w:val="false"/>
+                <w:sz w:val="22"/>
+                <w:szCs w:val="22"/>
+              </w:rPr>
+              <w:t xml:space="preserve">"Maintaining torso angle below 45° reduces lumbar shear force [1]. Your torso reached 52° on rep 2."</w:t>
+            </w:r>
+          </w:p>
+        </w:tc>
+        <w:tc>
+          <w:tcPr>
+            <w:tcW w:type="dxa" w:w="3760"/>
+            <w:tcBorders>
+              <w:top w:val="single" w:color="CCCCCC" w:sz="4"/>
+              <w:left w:val="single" w:color="CCCCCC" w:sz="4"/>
+              <w:bottom w:val="single" w:color="CCCCCC" w:sz="4"/>
+              <w:right w:val="single" w:color="CCCCCC" w:sz="4"/>
+            </w:tcBorders>
+            <w:shd w:fill="F2F2F2" w:val="clear"/>
+            <w:tcMar>
+              <w:top w:type="dxa" w:w="80"/>
+              <w:left w:type="dxa" w:w="120"/>
+              <w:bottom w:type="dxa" w:w="80"/>
+              <w:right w:type="dxa" w:w="120"/>
+            </w:tcMar>
+            <w:vAlign w:val="top"/>
+          </w:tcPr>
+          <w:p>
+            <w:pPr>
+              <w:spacing w:after="80" w:before="80"/>
+              <w:jc w:val="left"/>
+            </w:pPr>
+            <w:r>
+              <w:rPr>
+                <w:rFonts w:ascii="Arial" w:cs="Arial" w:eastAsia="Arial" w:hAnsi="Arial"/>
+                <w:b w:val="false"/>
+                <w:bCs w:val="false"/>
+                <w:sz w:val="22"/>
+                <w:szCs w:val="22"/>
+              </w:rPr>
+              <w:t xml:space="preserve">"Your form could be better." (No citations, no rep reference.)</w:t>
+            </w:r>
+          </w:p>
+        </w:tc>
+      </w:tr>
+      <w:tr>
+        <w:tc>
+          <w:tcPr>
+            <w:tcW w:type="dxa" w:w="1400"/>
+            <w:tcBorders>
+              <w:top w:val="single" w:color="CCCCCC" w:sz="4"/>
+              <w:left w:val="single" w:color="CCCCCC" w:sz="4"/>
+              <w:bottom w:val="single" w:color="CCCCCC" w:sz="4"/>
+              <w:right w:val="single" w:color="CCCCCC" w:sz="4"/>
+            </w:tcBorders>
+            <w:shd w:fill="FFFFFF" w:val="clear"/>
+            <w:tcMar>
+              <w:top w:type="dxa" w:w="80"/>
+              <w:left w:type="dxa" w:w="120"/>
+              <w:bottom w:type="dxa" w:w="80"/>
+              <w:right w:type="dxa" w:w="120"/>
+            </w:tcMar>
+            <w:vAlign w:val="top"/>
+          </w:tcPr>
+          <w:p>
+            <w:pPr>
+              <w:spacing w:after="80" w:before="80"/>
+              <w:jc w:val="left"/>
+            </w:pPr>
+            <w:r>
+              <w:rPr>
+                <w:rFonts w:ascii="Arial" w:cs="Arial" w:eastAsia="Arial" w:hAnsi="Arial"/>
+                <w:b w:val="false"/>
+                <w:bCs w:val="false"/>
+                <w:sz w:val="22"/>
+                <w:szCs w:val="22"/>
+              </w:rPr>
+              <w:t xml:space="preserve">Safety warnings</w:t>
+            </w:r>
+          </w:p>
+        </w:tc>
+        <w:tc>
+          <w:tcPr>
+            <w:tcW w:type="dxa" w:w="4200"/>
+            <w:tcBorders>
+              <w:top w:val="single" w:color="CCCCCC" w:sz="4"/>
+              <w:left w:val="single" w:color="CCCCCC" w:sz="4"/>
+              <w:bottom w:val="single" w:color="CCCCCC" w:sz="4"/>
+              <w:right w:val="single" w:color="CCCCCC" w:sz="4"/>
+            </w:tcBorders>
+            <w:shd w:fill="FFFFFF" w:val="clear"/>
+            <w:tcMar>
+              <w:top w:type="dxa" w:w="80"/>
+              <w:left w:type="dxa" w:w="120"/>
+              <w:bottom w:type="dxa" w:w="80"/>
+              <w:right w:type="dxa" w:w="120"/>
+            </w:tcMar>
+            <w:vAlign w:val="top"/>
+          </w:tcPr>
+          <w:p>
+            <w:pPr>
+              <w:spacing w:after="80" w:before="80"/>
+              <w:jc w:val="left"/>
+            </w:pPr>
+            <w:r>
+              <w:rPr>
+                <w:rFonts w:ascii="Arial" w:cs="Arial" w:eastAsia="Arial" w:hAnsi="Arial"/>
+                <w:b w:val="false"/>
+                <w:bCs w:val="false"/>
+                <w:sz w:val="22"/>
+                <w:szCs w:val="22"/>
+              </w:rPr>
+              <w:t xml:space="preserve">"Movement Quality alert: Torso lean exceeded 50° on reps 2 and 4. Consider reducing load."</w:t>
+            </w:r>
+          </w:p>
+        </w:tc>
+        <w:tc>
+          <w:tcPr>
+            <w:tcW w:type="dxa" w:w="3760"/>
+            <w:tcBorders>
+              <w:top w:val="single" w:color="CCCCCC" w:sz="4"/>
+              <w:left w:val="single" w:color="CCCCCC" w:sz="4"/>
+              <w:bottom w:val="single" w:color="CCCCCC" w:sz="4"/>
+              <w:right w:val="single" w:color="CCCCCC" w:sz="4"/>
+            </w:tcBorders>
+            <w:shd w:fill="FFFFFF" w:val="clear"/>
+            <w:tcMar>
+              <w:top w:type="dxa" w:w="80"/>
+              <w:left w:type="dxa" w:w="120"/>
+              <w:bottom w:type="dxa" w:w="80"/>
+              <w:right w:type="dxa" w:w="120"/>
+            </w:tcMar>
+            <w:vAlign w:val="top"/>
+          </w:tcPr>
+          <w:p>
+            <w:pPr>
+              <w:spacing w:after="80" w:before="80"/>
+              <w:jc w:val="left"/>
+            </w:pPr>
+            <w:r>
+              <w:rPr>
+                <w:rFonts w:ascii="Arial" w:cs="Arial" w:eastAsia="Arial" w:hAnsi="Arial"/>
+                <w:b w:val="false"/>
+                <w:bCs w:val="false"/>
+                <w:sz w:val="22"/>
+                <w:szCs w:val="22"/>
+              </w:rPr>
+              <w:t xml:space="preserve">"You might get injured if you keep lifting like this." (Prohibited language.)</w:t>
+            </w:r>
+          </w:p>
+        </w:tc>
+      </w:tr>
+      <w:tr>
+        <w:tc>
+          <w:tcPr>
+            <w:tcW w:type="dxa" w:w="1400"/>
+            <w:tcBorders>
+              <w:top w:val="single" w:color="CCCCCC" w:sz="4"/>
+              <w:left w:val="single" w:color="CCCCCC" w:sz="4"/>
+              <w:bottom w:val="single" w:color="CCCCCC" w:sz="4"/>
+              <w:right w:val="single" w:color="CCCCCC" w:sz="4"/>
+            </w:tcBorders>
+            <w:shd w:fill="F2F2F2" w:val="clear"/>
+            <w:tcMar>
+              <w:top w:type="dxa" w:w="80"/>
+              <w:left w:type="dxa" w:w="120"/>
+              <w:bottom w:type="dxa" w:w="80"/>
+              <w:right w:type="dxa" w:w="120"/>
+            </w:tcMar>
+            <w:vAlign w:val="top"/>
+          </w:tcPr>
+          <w:p>
+            <w:pPr>
+              <w:spacing w:after="80" w:before="80"/>
+              <w:jc w:val="left"/>
+            </w:pPr>
+            <w:r>
+              <w:rPr>
+                <w:rFonts w:ascii="Arial" w:cs="Arial" w:eastAsia="Arial" w:hAnsi="Arial"/>
+                <w:b w:val="false"/>
+                <w:bCs w:val="false"/>
+                <w:sz w:val="22"/>
+                <w:szCs w:val="22"/>
+              </w:rPr>
+              <w:t xml:space="preserve">Cues</w:t>
+            </w:r>
+          </w:p>
+        </w:tc>
+        <w:tc>
+          <w:tcPr>
+            <w:tcW w:type="dxa" w:w="4200"/>
+            <w:tcBorders>
+              <w:top w:val="single" w:color="CCCCCC" w:sz="4"/>
+              <w:left w:val="single" w:color="CCCCCC" w:sz="4"/>
+              <w:bottom w:val="single" w:color="CCCCCC" w:sz="4"/>
+              <w:right w:val="single" w:color="CCCCCC" w:sz="4"/>
+            </w:tcBorders>
+            <w:shd w:fill="F2F2F2" w:val="clear"/>
+            <w:tcMar>
+              <w:top w:type="dxa" w:w="80"/>
+              <w:left w:type="dxa" w:w="120"/>
+              <w:bottom w:type="dxa" w:w="80"/>
+              <w:right w:type="dxa" w:w="120"/>
+            </w:tcMar>
+            <w:vAlign w:val="top"/>
+          </w:tcPr>
+          <w:p>
+            <w:pPr>
+              <w:spacing w:after="80" w:before="80"/>
+              <w:jc w:val="left"/>
+            </w:pPr>
+            <w:r>
+              <w:rPr>
+                <w:rFonts w:ascii="Arial" w:cs="Arial" w:eastAsia="Arial" w:hAnsi="Arial"/>
+                <w:b w:val="false"/>
+                <w:bCs w:val="false"/>
+                <w:sz w:val="22"/>
+                <w:szCs w:val="22"/>
+              </w:rPr>
+              <w:t xml:space="preserve">"Cue: spread the floor apart with your feet during descent. This engages hip external rotators."</w:t>
+            </w:r>
+          </w:p>
+        </w:tc>
+        <w:tc>
+          <w:tcPr>
+            <w:tcW w:type="dxa" w:w="3760"/>
+            <w:tcBorders>
+              <w:top w:val="single" w:color="CCCCCC" w:sz="4"/>
+              <w:left w:val="single" w:color="CCCCCC" w:sz="4"/>
+              <w:bottom w:val="single" w:color="CCCCCC" w:sz="4"/>
+              <w:right w:val="single" w:color="CCCCCC" w:sz="4"/>
+            </w:tcBorders>
+            <w:shd w:fill="F2F2F2" w:val="clear"/>
+            <w:tcMar>
+              <w:top w:type="dxa" w:w="80"/>
+              <w:left w:type="dxa" w:w="120"/>
+              <w:bottom w:type="dxa" w:w="80"/>
+              <w:right w:type="dxa" w:w="120"/>
+            </w:tcMar>
+            <w:vAlign w:val="top"/>
+          </w:tcPr>
+          <w:p>
+            <w:pPr>
+              <w:spacing w:after="80" w:before="80"/>
+              <w:jc w:val="left"/>
+            </w:pPr>
+            <w:r>
+              <w:rPr>
+                <w:rFonts w:ascii="Arial" w:cs="Arial" w:eastAsia="Arial" w:hAnsi="Arial"/>
+                <w:b w:val="false"/>
+                <w:bCs w:val="false"/>
+                <w:sz w:val="22"/>
+                <w:szCs w:val="22"/>
+              </w:rPr>
+              <w:t xml:space="preserve">"Keep your knees out." (Too vague, no mechanism.)</w:t>
+            </w:r>
+          </w:p>
+        </w:tc>
+      </w:tr>
+      <w:tr>
+        <w:tc>
+          <w:tcPr>
+            <w:tcW w:type="dxa" w:w="1400"/>
+            <w:tcBorders>
+              <w:top w:val="single" w:color="CCCCCC" w:sz="4"/>
+              <w:left w:val="single" w:color="CCCCCC" w:sz="4"/>
+              <w:bottom w:val="single" w:color="CCCCCC" w:sz="4"/>
+              <w:right w:val="single" w:color="CCCCCC" w:sz="4"/>
+            </w:tcBorders>
+            <w:shd w:fill="FFFFFF" w:val="clear"/>
+            <w:tcMar>
+              <w:top w:type="dxa" w:w="80"/>
+              <w:left w:type="dxa" w:w="120"/>
+              <w:bottom w:type="dxa" w:w="80"/>
+              <w:right w:type="dxa" w:w="120"/>
+            </w:tcMar>
+            <w:vAlign w:val="top"/>
+          </w:tcPr>
+          <w:p>
+            <w:pPr>
+              <w:spacing w:after="80" w:before="80"/>
+              <w:jc w:val="left"/>
+            </w:pPr>
+            <w:r>
+              <w:rPr>
+                <w:rFonts w:ascii="Arial" w:cs="Arial" w:eastAsia="Arial" w:hAnsi="Arial"/>
+                <w:b w:val="false"/>
+                <w:bCs w:val="false"/>
+                <w:sz w:val="22"/>
+                <w:szCs w:val="22"/>
+              </w:rPr>
+              <w:t xml:space="preserve">Issue severity</w:t>
+            </w:r>
+          </w:p>
+        </w:tc>
+        <w:tc>
+          <w:tcPr>
+            <w:tcW w:type="dxa" w:w="4200"/>
+            <w:tcBorders>
+              <w:top w:val="single" w:color="CCCCCC" w:sz="4"/>
+              <w:left w:val="single" w:color="CCCCCC" w:sz="4"/>
+              <w:bottom w:val="single" w:color="CCCCCC" w:sz="4"/>
+              <w:right w:val="single" w:color="CCCCCC" w:sz="4"/>
+            </w:tcBorders>
+            <w:shd w:fill="FFFFFF" w:val="clear"/>
+            <w:tcMar>
+              <w:top w:type="dxa" w:w="80"/>
+              <w:left w:type="dxa" w:w="120"/>
+              <w:bottom w:type="dxa" w:w="80"/>
+              <w:right w:type="dxa" w:w="120"/>
+            </w:tcMar>
+            <w:vAlign w:val="top"/>
+          </w:tcPr>
+          <w:p>
+            <w:pPr>
+              <w:spacing w:after="80" w:before="80"/>
+              <w:jc w:val="left"/>
+            </w:pPr>
+            <w:r>
+              <w:rPr>
+                <w:rFonts w:ascii="Arial" w:cs="Arial" w:eastAsia="Arial" w:hAnsi="Arial"/>
+                <w:b w:val="false"/>
+                <w:bCs w:val="false"/>
+                <w:sz w:val="22"/>
+                <w:szCs w:val="22"/>
+              </w:rPr>
+              <w:t xml:space="preserve">High: "Excessive forward lean (52° on rep 2) [2]." Medium: "Tempo inconsistency — rep 4 was 0.8s vs 1.2s avg."</w:t>
+            </w:r>
+          </w:p>
+        </w:tc>
+        <w:tc>
+          <w:tcPr>
+            <w:tcW w:type="dxa" w:w="3760"/>
+            <w:tcBorders>
+              <w:top w:val="single" w:color="CCCCCC" w:sz="4"/>
+              <w:left w:val="single" w:color="CCCCCC" w:sz="4"/>
+              <w:bottom w:val="single" w:color="CCCCCC" w:sz="4"/>
+              <w:right w:val="single" w:color="CCCCCC" w:sz="4"/>
+            </w:tcBorders>
+            <w:shd w:fill="FFFFFF" w:val="clear"/>
+            <w:tcMar>
+              <w:top w:type="dxa" w:w="80"/>
+              <w:left w:type="dxa" w:w="120"/>
+              <w:bottom w:type="dxa" w:w="80"/>
+              <w:right w:type="dxa" w:w="120"/>
+            </w:tcMar>
+            <w:vAlign w:val="top"/>
+          </w:tcPr>
+          <w:p>
+            <w:pPr>
+              <w:spacing w:after="80" w:before="80"/>
+              <w:jc w:val="left"/>
+            </w:pPr>
+            <w:r>
+              <w:rPr>
+                <w:rFonts w:ascii="Arial" w:cs="Arial" w:eastAsia="Arial" w:hAnsi="Arial"/>
+                <w:b w:val="false"/>
+                <w:bCs w:val="false"/>
+                <w:sz w:val="22"/>
+                <w:szCs w:val="22"/>
+              </w:rPr>
+              <w:t xml:space="preserve">All issues marked Medium. No rep numbers or measurements.</w:t>
+            </w:r>
+          </w:p>
+        </w:tc>
+      </w:tr>
+    </w:tbl>
+    <w:p>
+      <w:pPr>
+        <w:pStyle w:val="Heading2"/>
+        <w:spacing w:after="100" w:before="200"/>
+      </w:pPr>
+      <w:r>
+        <w:rPr>
+          <w:rFonts w:ascii="Arial" w:cs="Arial" w:eastAsia="Arial" w:hAnsi="Arial"/>
+          <w:b/>
+          <w:bCs/>
+          <w:color w:val="2E75B6"/>
+          <w:sz w:val="26"/>
+          <w:szCs w:val="26"/>
+        </w:rPr>
+        <w:t xml:space="preserve">4.5  Annotation Walkthrough — Worked Example</w:t>
+      </w:r>
+    </w:p>
+    <w:p>
+      <w:pPr>
+        <w:spacing w:after="60" w:before="60"/>
+        <w:jc w:val="left"/>
+      </w:pPr>
+      <w:r>
+        <w:rPr>
+          <w:rFonts w:ascii="Arial" w:cs="Arial" w:eastAsia="Arial" w:hAnsi="Arial"/>
+          <w:b w:val="false"/>
+          <w:bCs w:val="false"/>
+          <w:sz w:val="22"/>
+          <w:szCs w:val="22"/>
+        </w:rPr>
+        <w:t xml:space="preserve">Here is a step-by-step walkthrough of how to review a squat analysis. Use this as a mental model for your first few reviews.</w:t>
+      </w:r>
+    </w:p>
+    <w:p>
+      <w:pPr>
+        <w:spacing w:after="40" w:before="40"/>
+        <w:jc w:val="left"/>
+      </w:pPr>
+      <w:r>
+        <w:rPr>
+          <w:rFonts w:ascii="Arial" w:cs="Arial" w:eastAsia="Arial" w:hAnsi="Arial"/>
+          <w:b/>
+          <w:bCs/>
+          <w:sz w:val="22"/>
+          <w:szCs w:val="22"/>
+        </w:rPr>
+        <w:t xml:space="preserve">Scenario: A high-bar squat analysis with 5 reps, Moderate confidence, Movement Quality score of 5.8.</w:t>
       </w:r>
     </w:p>
     <w:p>
@@ -5314,7 +6914,7 @@
           <w:sz w:val="22"/>
           <w:szCs w:val="22"/>
         </w:rPr>
-        <w:t xml:space="preserve">Coaching Quality Score — Enter a value from 1.0 to 10.0 in increments of 0.1. This is your overall judgment of the coaching output quality.</w:t>
+        <w:t xml:space="preserve">Open the analysis detail page. Note the confidence badge is blue (Moderate) — scores are generally reliable but double-check any borderline claims.</w:t>
       </w:r>
     </w:p>
     <w:p>
@@ -5334,7 +6934,7 @@
           <w:sz w:val="22"/>
           <w:szCs w:val="22"/>
         </w:rPr>
-        <w:t xml:space="preserve">Movement Quality Advice Accurate? — Radio buttons: Yes / No / N/A. Select N/A if there are no Movement Quality alerts in the output.</w:t>
+        <w:t xml:space="preserve">Check the 5 score cards. Movement Quality is 5.8 (Intermediate, amber). Technique is 7.2, Path &amp; Balance is 8.1, Control is 6.0.</w:t>
       </w:r>
     </w:p>
     <w:p>
@@ -5354,7 +6954,7 @@
           <w:sz w:val="22"/>
           <w:szCs w:val="22"/>
         </w:rPr>
-        <w:t xml:space="preserve">Engagement Advice Accurate? — Radio buttons: Yes / No / N/A. Select N/A if the coaching contains no engagement-related advice.</w:t>
+        <w:t xml:space="preserve">Watch the annotated video. Look for excessive torso lean (Movement Quality) and inconsistent reps (Control). Note what you observe.</w:t>
       </w:r>
     </w:p>
     <w:p>
@@ -5374,31 +6974,87 @@
           <w:sz w:val="22"/>
           <w:szCs w:val="22"/>
         </w:rPr>
-        <w:t xml:space="preserve">Issues Identified — Tick the issues present in the lift. Checkboxes are grouped by exercise and each has a severity (High / Medium / Low) and an optional notes field that appears when you tick it.</w:t>
-      </w:r>
-    </w:p>
-    <w:p>
-      <w:pPr>
-        <w:spacing w:after="0" w:before="80"/>
-      </w:pPr>
-      <w:r>
-        <w:t xml:space="preserve"/>
-      </w:r>
-    </w:p>
-    <w:p>
-      <w:pPr>
-        <w:spacing w:after="40" w:before="80"/>
-        <w:jc w:val="left"/>
-      </w:pPr>
-      <w:r>
-        <w:rPr>
-          <w:rFonts w:ascii="Arial" w:cs="Arial" w:eastAsia="Arial" w:hAnsi="Arial"/>
-          <w:b/>
-          <w:bCs/>
+        <w:t xml:space="preserve">Read the coaching output. The AI says: "Depth was adequate on all reps, with hip angles ranging from 82° to 88°." Cross-check against the rep metrics.</w:t>
+      </w:r>
+    </w:p>
+    <w:p>
+      <w:pPr>
+        <w:pStyle w:val="ListParagraph"/>
+        <w:numPr>
+          <w:ilvl w:val="0"/>
+          <w:numId w:val="4"/>
+        </w:numPr>
+        <w:spacing w:after="40" w:before="40"/>
+      </w:pPr>
+      <w:r>
+        <w:rPr>
+          <w:rFonts w:ascii="Arial" w:cs="Arial" w:eastAsia="Arial" w:hAnsi="Arial"/>
+          <w:b w:val="false"/>
+          <w:bCs w:val="false"/>
           <w:sz w:val="22"/>
           <w:szCs w:val="22"/>
         </w:rPr>
-        <w:t xml:space="preserve">Squat issues:</w:t>
+        <w:t xml:space="preserve">The AI also says: "Knee valgus was observed on rep 3." Knee valgus cannot be measured from side view. This is a false positive.</w:t>
+      </w:r>
+    </w:p>
+    <w:p>
+      <w:pPr>
+        <w:pStyle w:val="ListParagraph"/>
+        <w:numPr>
+          <w:ilvl w:val="0"/>
+          <w:numId w:val="4"/>
+        </w:numPr>
+        <w:spacing w:after="40" w:before="40"/>
+      </w:pPr>
+      <w:r>
+        <w:rPr>
+          <w:rFonts w:ascii="Arial" w:cs="Arial" w:eastAsia="Arial" w:hAnsi="Arial"/>
+          <w:b w:val="false"/>
+          <w:bCs w:val="false"/>
+          <w:sz w:val="22"/>
+          <w:szCs w:val="22"/>
+        </w:rPr>
+        <w:t xml:space="preserve">Check citations. Hover [1] and [2] markers — are the cited papers relevant? Do markers appear inline, or only at the bottom?</w:t>
+      </w:r>
+    </w:p>
+    <w:p>
+      <w:pPr>
+        <w:pStyle w:val="ListParagraph"/>
+        <w:numPr>
+          <w:ilvl w:val="0"/>
+          <w:numId w:val="4"/>
+        </w:numPr>
+        <w:spacing w:after="40" w:before="40"/>
+      </w:pPr>
+      <w:r>
+        <w:rPr>
+          <w:rFonts w:ascii="Arial" w:cs="Arial" w:eastAsia="Arial" w:hAnsi="Arial"/>
+          <w:b w:val="false"/>
+          <w:bCs w:val="false"/>
+          <w:sz w:val="22"/>
+          <w:szCs w:val="22"/>
+        </w:rPr>
+        <w:t xml:space="preserve">Check eval scores. Faithfulness 91% (green). CoVe Verified. No unsupported claims. Good sign.</w:t>
+      </w:r>
+    </w:p>
+    <w:p>
+      <w:pPr>
+        <w:pStyle w:val="ListParagraph"/>
+        <w:numPr>
+          <w:ilvl w:val="0"/>
+          <w:numId w:val="4"/>
+        </w:numPr>
+        <w:spacing w:after="40" w:before="40"/>
+      </w:pPr>
+      <w:r>
+        <w:rPr>
+          <w:rFonts w:ascii="Arial" w:cs="Arial" w:eastAsia="Arial" w:hAnsi="Arial"/>
+          <w:b w:val="false"/>
+          <w:bCs w:val="false"/>
+          <w:sz w:val="22"/>
+          <w:szCs w:val="22"/>
+        </w:rPr>
+        <w:t xml:space="preserve">Fill in the annotation form:</w:t>
       </w:r>
     </w:p>
     <w:p>
@@ -5418,7 +7074,7 @@
           <w:sz w:val="22"/>
           <w:szCs w:val="22"/>
         </w:rPr>
-        <w:t xml:space="preserve">Insufficient depth</w:t>
+        <w:t xml:space="preserve">Coaching Quality Score: 6.5 (decent overall, but the valgus false positive brings it down)</w:t>
       </w:r>
     </w:p>
     <w:p>
@@ -5438,7 +7094,7 @@
           <w:sz w:val="22"/>
           <w:szCs w:val="22"/>
         </w:rPr>
-        <w:t xml:space="preserve">Excessive forward lean</w:t>
+        <w:t xml:space="preserve">Movement Quality Advice Accurate: Yes (torso lean observation matches the video)</w:t>
       </w:r>
     </w:p>
     <w:p>
@@ -5458,7 +7114,7 @@
           <w:sz w:val="22"/>
           <w:szCs w:val="22"/>
         </w:rPr>
-        <w:t xml:space="preserve">Knee tracking issues at depth</w:t>
+        <w:t xml:space="preserve">Engagement Advice Accurate: Yes (cues are specific and actionable)</w:t>
       </w:r>
     </w:p>
     <w:p>
@@ -5478,7 +7134,7 @@
           <w:sz w:val="22"/>
           <w:szCs w:val="22"/>
         </w:rPr>
-        <w:t xml:space="preserve">Incomplete lockout</w:t>
+        <w:t xml:space="preserve">Issue: check "Knee tracking issues at depth", set severity Medium, note: "AI claimed knee valgus from side view — not measurable. False positive."</w:t>
       </w:r>
     </w:p>
     <w:p>
@@ -5498,31 +7154,118 @@
           <w:sz w:val="22"/>
           <w:szCs w:val="22"/>
         </w:rPr>
-        <w:t xml:space="preserve">Inconsistent rep tempo</w:t>
-      </w:r>
-    </w:p>
-    <w:p>
-      <w:pPr>
-        <w:spacing w:after="0" w:before="80"/>
-      </w:pPr>
-      <w:r>
-        <w:t xml:space="preserve"/>
-      </w:r>
-    </w:p>
-    <w:p>
-      <w:pPr>
-        <w:spacing w:after="40" w:before="80"/>
-        <w:jc w:val="left"/>
+        <w:t xml:space="preserve">AI identified a non-issue: "Knee valgus on rep 3 — not visible from sagittal camera angle."</w:t>
+      </w:r>
+    </w:p>
+    <w:p>
+      <w:pPr>
+        <w:pStyle w:val="ListParagraph"/>
+        <w:numPr>
+          <w:ilvl w:val="0"/>
+          <w:numId w:val="5"/>
+        </w:numPr>
+        <w:spacing w:after="40" w:before="40"/>
+      </w:pPr>
+      <w:r>
+        <w:rPr>
+          <w:rFonts w:ascii="Arial" w:cs="Arial" w:eastAsia="Arial" w:hAnsi="Arial"/>
+          <w:b w:val="false"/>
+          <w:bCs w:val="false"/>
+          <w:sz w:val="22"/>
+          <w:szCs w:val="22"/>
+        </w:rPr>
+        <w:t xml:space="preserve">Do NOT mark as golden — the false positive disqualifies it.</w:t>
+      </w:r>
+    </w:p>
+    <w:p>
+      <w:pPr>
+        <w:pStyle w:val="ListParagraph"/>
+        <w:numPr>
+          <w:ilvl w:val="0"/>
+          <w:numId w:val="4"/>
+        </w:numPr>
+        <w:spacing w:after="40" w:before="40"/>
+      </w:pPr>
+      <w:r>
+        <w:rPr>
+          <w:rFonts w:ascii="Arial" w:cs="Arial" w:eastAsia="Arial" w:hAnsi="Arial"/>
+          <w:b w:val="false"/>
+          <w:bCs w:val="false"/>
+          <w:sz w:val="22"/>
+          <w:szCs w:val="22"/>
+        </w:rPr>
+        <w:t xml:space="preserve">Click Submit. Green banner confirms success.</w:t>
+      </w:r>
+    </w:p>
+    <w:p>
+      <w:r>
+        <w:br w:type="page"/>
+      </w:r>
+    </w:p>
+    <w:p>
+      <w:pPr>
+        <w:pStyle w:val="Heading2"/>
+        <w:spacing w:after="100" w:before="200"/>
       </w:pPr>
       <w:r>
         <w:rPr>
           <w:rFonts w:ascii="Arial" w:cs="Arial" w:eastAsia="Arial" w:hAnsi="Arial"/>
           <w:b/>
           <w:bCs/>
+          <w:color w:val="2E75B6"/>
+          <w:sz w:val="26"/>
+          <w:szCs w:val="26"/>
+        </w:rPr>
+        <w:t xml:space="preserve">4.6  Previous Annotations</w:t>
+      </w:r>
+    </w:p>
+    <w:p>
+      <w:pPr>
+        <w:spacing w:after="80" w:before="60"/>
+        <w:jc w:val="left"/>
+      </w:pPr>
+      <w:r>
+        <w:rPr>
+          <w:rFonts w:ascii="Arial" w:cs="Arial" w:eastAsia="Arial" w:hAnsi="Arial"/>
+          <w:b w:val="false"/>
+          <w:bCs w:val="false"/>
           <w:sz w:val="22"/>
           <w:szCs w:val="22"/>
         </w:rPr>
-        <w:t xml:space="preserve">Bench Press issues:</w:t>
+        <w:t xml:space="preserve">If you have previously submitted an annotation for this analysis, it appears in a 'Previous Annotations' section above your form. Each past annotation shows the quality score, accuracy ratings, and any corrections you submitted. This lets you see your prior assessments.</w:t>
+      </w:r>
+    </w:p>
+    <w:p>
+      <w:pPr>
+        <w:pStyle w:val="Heading2"/>
+        <w:spacing w:after="100" w:before="200"/>
+      </w:pPr>
+      <w:r>
+        <w:rPr>
+          <w:rFonts w:ascii="Arial" w:cs="Arial" w:eastAsia="Arial" w:hAnsi="Arial"/>
+          <w:b/>
+          <w:bCs/>
+          <w:color w:val="2E75B6"/>
+          <w:sz w:val="26"/>
+          <w:szCs w:val="26"/>
+        </w:rPr>
+        <w:t xml:space="preserve">4.7  Your Annotation Form</w:t>
+      </w:r>
+    </w:p>
+    <w:p>
+      <w:pPr>
+        <w:spacing w:after="80" w:before="60"/>
+        <w:jc w:val="left"/>
+      </w:pPr>
+      <w:r>
+        <w:rPr>
+          <w:rFonts w:ascii="Arial" w:cs="Arial" w:eastAsia="Arial" w:hAnsi="Arial"/>
+          <w:b w:val="false"/>
+          <w:bCs w:val="false"/>
+          <w:sz w:val="22"/>
+          <w:szCs w:val="22"/>
+        </w:rPr>
+        <w:t xml:space="preserve">Complete all relevant fields and click Submit.</w:t>
       </w:r>
     </w:p>
     <w:p>
@@ -5542,7 +7285,7 @@
           <w:sz w:val="22"/>
           <w:szCs w:val="22"/>
         </w:rPr>
-        <w:t xml:space="preserve">Excessive shoulder angle at bottom</w:t>
+        <w:t xml:space="preserve">Coaching Quality Score — Enter a value from 1.0 to 10.0 in increments of 0.1. This is your overall judgment of the coaching output quality.</w:t>
       </w:r>
     </w:p>
     <w:p>
@@ -5562,7 +7305,7 @@
           <w:sz w:val="22"/>
           <w:szCs w:val="22"/>
         </w:rPr>
-        <w:t xml:space="preserve">Incomplete lockout</w:t>
+        <w:t xml:space="preserve">Movement Quality Advice Accurate? — Radio buttons: Yes / No / N/A. Select N/A if there are no Movement Quality alerts in the output.</w:t>
       </w:r>
     </w:p>
     <w:p>
@@ -5582,7 +7325,7 @@
           <w:sz w:val="22"/>
           <w:szCs w:val="22"/>
         </w:rPr>
-        <w:t xml:space="preserve">Inconsistent rep tempo</w:t>
+        <w:t xml:space="preserve">Engagement Advice Accurate? — Radio buttons: Yes / No / N/A. Select N/A if the coaching contains no engagement-related advice.</w:t>
       </w:r>
     </w:p>
     <w:p>
@@ -5602,7 +7345,7 @@
           <w:sz w:val="22"/>
           <w:szCs w:val="22"/>
         </w:rPr>
-        <w:t xml:space="preserve">Bar path deviation</w:t>
+        <w:t xml:space="preserve">Issues Identified — Tick the issues present in the lift. Checkboxes are grouped by exercise and each has a severity (High / Medium / Low) and an optional notes field that appears when you tick it.</w:t>
       </w:r>
     </w:p>
     <w:p>
@@ -5626,7 +7369,7 @@
           <w:sz w:val="22"/>
           <w:szCs w:val="22"/>
         </w:rPr>
-        <w:t xml:space="preserve">Deadlift issues:</w:t>
+        <w:t xml:space="preserve">Squat issues:</w:t>
       </w:r>
     </w:p>
     <w:p>
@@ -5646,7 +7389,7 @@
           <w:sz w:val="22"/>
           <w:szCs w:val="22"/>
         </w:rPr>
-        <w:t xml:space="preserve">Excessive torso lean at start</w:t>
+        <w:t xml:space="preserve">Insufficient depth</w:t>
       </w:r>
     </w:p>
     <w:p>
@@ -5666,7 +7409,7 @@
           <w:sz w:val="22"/>
           <w:szCs w:val="22"/>
         </w:rPr>
-        <w:t xml:space="preserve">Incomplete hip extension at lockout</w:t>
+        <w:t xml:space="preserve">Excessive forward lean</w:t>
       </w:r>
     </w:p>
     <w:p>
@@ -5686,7 +7429,7 @@
           <w:sz w:val="22"/>
           <w:szCs w:val="22"/>
         </w:rPr>
-        <w:t xml:space="preserve">Inconsistent rep tempo</w:t>
+        <w:t xml:space="preserve">Knee tracking issues at depth</w:t>
       </w:r>
     </w:p>
     <w:p>
@@ -5706,7 +7449,27 @@
           <w:sz w:val="22"/>
           <w:szCs w:val="22"/>
         </w:rPr>
-        <w:t xml:space="preserve">Bar path deviation</w:t>
+        <w:t xml:space="preserve">Incomplete lockout</w:t>
+      </w:r>
+    </w:p>
+    <w:p>
+      <w:pPr>
+        <w:pStyle w:val="ListParagraph"/>
+        <w:numPr>
+          <w:ilvl w:val="0"/>
+          <w:numId w:val="7"/>
+        </w:numPr>
+        <w:spacing w:after="40" w:before="40"/>
+      </w:pPr>
+      <w:r>
+        <w:rPr>
+          <w:rFonts w:ascii="Arial" w:cs="Arial" w:eastAsia="Arial" w:hAnsi="Arial"/>
+          <w:b w:val="false"/>
+          <w:bCs w:val="false"/>
+          <w:sz w:val="22"/>
+          <w:szCs w:val="22"/>
+        </w:rPr>
+        <w:t xml:space="preserve">Inconsistent rep tempo</w:t>
       </w:r>
     </w:p>
     <w:p>
@@ -5730,208 +7493,7 @@
           <w:sz w:val="22"/>
           <w:szCs w:val="22"/>
         </w:rPr>
-        <w:t xml:space="preserve">Additional free-text fields:</w:t>
-      </w:r>
-    </w:p>
-    <w:p>
-      <w:pPr>
-        <w:spacing w:after="40" w:before="40"/>
-      </w:pPr>
-      <w:r>
-        <w:rPr>
-          <w:rFonts w:ascii="Arial" w:cs="Arial" w:eastAsia="Arial" w:hAnsi="Arial"/>
-          <w:b/>
-          <w:bCs/>
-          <w:sz w:val="22"/>
-          <w:szCs w:val="22"/>
-        </w:rPr>
-        <w:t xml:space="preserve">AI missed an issue</w:t>
-      </w:r>
-      <w:r>
-        <w:rPr>
-          <w:rFonts w:ascii="Arial" w:cs="Arial" w:eastAsia="Arial" w:hAnsi="Arial"/>
-          <w:sz w:val="22"/>
-          <w:szCs w:val="22"/>
-        </w:rPr>
-        <w:t xml:space="preserve"> — describe an issue the AI coaching did not mention.</w:t>
-      </w:r>
-    </w:p>
-    <w:p>
-      <w:pPr>
-        <w:spacing w:after="80" w:before="40"/>
-      </w:pPr>
-      <w:r>
-        <w:rPr>
-          <w:rFonts w:ascii="Arial" w:cs="Arial" w:eastAsia="Arial" w:hAnsi="Arial"/>
-          <w:b/>
-          <w:bCs/>
-          <w:sz w:val="22"/>
-          <w:szCs w:val="22"/>
-        </w:rPr>
-        <w:t xml:space="preserve">AI identified a non-issue</w:t>
-      </w:r>
-      <w:r>
-        <w:rPr>
-          <w:rFonts w:ascii="Arial" w:cs="Arial" w:eastAsia="Arial" w:hAnsi="Arial"/>
-          <w:sz w:val="22"/>
-          <w:szCs w:val="22"/>
-        </w:rPr>
-        <w:t xml:space="preserve"> — describe something the AI flagged that is not actually a problem.</w:t>
-      </w:r>
-    </w:p>
-    <w:p>
-      <w:pPr>
-        <w:pStyle w:val="ListParagraph"/>
-        <w:numPr>
-          <w:ilvl w:val="0"/>
-          <w:numId w:val="4"/>
-        </w:numPr>
-        <w:spacing w:after="40" w:before="40"/>
-      </w:pPr>
-      <w:r>
-        <w:rPr>
-          <w:rFonts w:ascii="Arial" w:cs="Arial" w:eastAsia="Arial" w:hAnsi="Arial"/>
-          <w:b w:val="false"/>
-          <w:bCs w:val="false"/>
-          <w:sz w:val="22"/>
-          <w:szCs w:val="22"/>
-        </w:rPr>
-        <w:t xml:space="preserve">Suggested Corrections — Free-text area. Describe any corrections the AI should have made to its coaching.</w:t>
-      </w:r>
-    </w:p>
-    <w:p>
-      <w:pPr>
-        <w:pStyle w:val="ListParagraph"/>
-        <w:numPr>
-          <w:ilvl w:val="0"/>
-          <w:numId w:val="4"/>
-        </w:numPr>
-        <w:spacing w:after="40" w:before="40"/>
-      </w:pPr>
-      <w:r>
-        <w:rPr>
-          <w:rFonts w:ascii="Arial" w:cs="Arial" w:eastAsia="Arial" w:hAnsi="Arial"/>
-          <w:b w:val="false"/>
-          <w:bCs w:val="false"/>
-          <w:sz w:val="22"/>
-          <w:szCs w:val="22"/>
-        </w:rPr>
-        <w:t xml:space="preserve">Cited Sources — Add specific papers that support your assessment. Each entry has fields for Title, Authors, Year, and DOI. Click + Add Source to add a row. Click Remove to delete one.</w:t>
-      </w:r>
-    </w:p>
-    <w:p>
-      <w:pPr>
-        <w:pStyle w:val="ListParagraph"/>
-        <w:numPr>
-          <w:ilvl w:val="0"/>
-          <w:numId w:val="4"/>
-        </w:numPr>
-        <w:spacing w:after="40" w:before="40"/>
-      </w:pPr>
-      <w:r>
-        <w:rPr>
-          <w:rFonts w:ascii="Arial" w:cs="Arial" w:eastAsia="Arial" w:hAnsi="Arial"/>
-          <w:b w:val="false"/>
-          <w:bCs w:val="false"/>
-          <w:sz w:val="22"/>
-          <w:szCs w:val="22"/>
-        </w:rPr>
-        <w:t xml:space="preserve">Mark as golden dataset entry — Tick this if the analysis and coaching meet all golden quality criteria (see Section 5). Golden entries are used for fine-tuning and evaluation benchmarks.</w:t>
-      </w:r>
-    </w:p>
-    <w:p>
-      <w:pPr>
-        <w:spacing w:after="0" w:before="100"/>
-      </w:pPr>
-      <w:r>
-        <w:t xml:space="preserve"/>
-      </w:r>
-    </w:p>
-    <w:p>
-      <w:pPr>
-        <w:spacing w:after="100" w:before="60"/>
-        <w:jc w:val="left"/>
-      </w:pPr>
-      <w:r>
-        <w:rPr>
-          <w:rFonts w:ascii="Arial" w:cs="Arial" w:eastAsia="Arial" w:hAnsi="Arial"/>
-          <w:b w:val="false"/>
-          <w:bCs w:val="false"/>
-          <w:sz w:val="22"/>
-          <w:szCs w:val="22"/>
-        </w:rPr>
-        <w:t xml:space="preserve">Click Submit. The button changes to Submitting… while the request is in flight. On success a green banner reads: Annotation submitted successfully. If the score is out of range or a network error occurs, a red error message appears below the form.</w:t>
-      </w:r>
-    </w:p>
-    <w:p>
-      <w:r>
-        <w:br w:type="page"/>
-      </w:r>
-    </w:p>
-    <w:p>
-      <w:pPr>
-        <w:pStyle w:val="Heading1"/>
-        <w:spacing w:after="120" w:before="240"/>
-      </w:pPr>
-      <w:r>
-        <w:rPr>
-          <w:rFonts w:ascii="Arial" w:cs="Arial" w:eastAsia="Arial" w:hAnsi="Arial"/>
-          <w:b/>
-          <w:bCs/>
-          <w:color w:val="1F3864"/>
-          <w:sz w:val="32"/>
-          <w:szCs w:val="32"/>
-        </w:rPr>
-        <w:t xml:space="preserve">5.  Golden Dataset Labelling</w:t>
-      </w:r>
-    </w:p>
-    <w:p>
-      <w:pPr>
-        <w:spacing w:after="100" w:before="80"/>
-        <w:jc w:val="left"/>
-      </w:pPr>
-      <w:r>
-        <w:rPr>
-          <w:rFonts w:ascii="Arial" w:cs="Arial" w:eastAsia="Arial" w:hAnsi="Arial"/>
-          <w:b w:val="false"/>
-          <w:bCs w:val="false"/>
-          <w:sz w:val="22"/>
-          <w:szCs w:val="22"/>
-        </w:rPr>
-        <w:t xml:space="preserve">A golden dataset entry is an analysis where the AI coaching was so accurate and complete that it can serve as a benchmark for evaluating future AI outputs. Use this label sparingly.</w:t>
-      </w:r>
-    </w:p>
-    <w:p>
-      <w:pPr>
-        <w:pStyle w:val="Heading2"/>
-        <w:spacing w:after="100" w:before="200"/>
-      </w:pPr>
-      <w:r>
-        <w:rPr>
-          <w:rFonts w:ascii="Arial" w:cs="Arial" w:eastAsia="Arial" w:hAnsi="Arial"/>
-          <w:b/>
-          <w:bCs/>
-          <w:color w:val="2E75B6"/>
-          <w:sz w:val="26"/>
-          <w:szCs w:val="26"/>
-        </w:rPr>
-        <w:t xml:space="preserve">Criteria for a Golden Entry</w:t>
-      </w:r>
-    </w:p>
-    <w:p>
-      <w:pPr>
-        <w:spacing w:after="60" w:before="60"/>
-        <w:jc w:val="left"/>
-      </w:pPr>
-      <w:r>
-        <w:rPr>
-          <w:rFonts w:ascii="Arial" w:cs="Arial" w:eastAsia="Arial" w:hAnsi="Arial"/>
-          <w:b w:val="false"/>
-          <w:bCs w:val="false"/>
-          <w:sz w:val="22"/>
-          <w:szCs w:val="22"/>
-        </w:rPr>
-        <w:t xml:space="preserve">All of the following must be true:</w:t>
+        <w:t xml:space="preserve">Bench Press issues:</w:t>
       </w:r>
     </w:p>
     <w:p>
@@ -5951,7 +7513,7 @@
           <w:sz w:val="22"/>
           <w:szCs w:val="22"/>
         </w:rPr>
-        <w:t xml:space="preserve">The coaching accurately describes the lift as shown in the annotated video.</w:t>
+        <w:t xml:space="preserve">Excessive shoulder angle at bottom</w:t>
       </w:r>
     </w:p>
     <w:p>
@@ -5971,7 +7533,7 @@
           <w:sz w:val="22"/>
           <w:szCs w:val="22"/>
         </w:rPr>
-        <w:t xml:space="preserve">All significant issues are identified with correct severity.</w:t>
+        <w:t xml:space="preserve">Incomplete lockout</w:t>
       </w:r>
     </w:p>
     <w:p>
@@ -5991,7 +7553,7 @@
           <w:sz w:val="22"/>
           <w:szCs w:val="22"/>
         </w:rPr>
-        <w:t xml:space="preserve">No false positives — the AI has not flagged anything that is not actually a problem.</w:t>
+        <w:t xml:space="preserve">Inconsistent rep tempo</w:t>
       </w:r>
     </w:p>
     <w:p>
@@ -6011,123 +7573,31 @@
           <w:sz w:val="22"/>
           <w:szCs w:val="22"/>
         </w:rPr>
-        <w:t xml:space="preserve">Citations are relevant, correctly attributed, and support the coaching claims.</w:t>
-      </w:r>
-    </w:p>
-    <w:p>
-      <w:pPr>
-        <w:pStyle w:val="ListParagraph"/>
-        <w:numPr>
-          <w:ilvl w:val="0"/>
-          <w:numId w:val="8"/>
-        </w:numPr>
-        <w:spacing w:after="40" w:before="40"/>
-      </w:pPr>
-      <w:r>
-        <w:rPr>
-          <w:rFonts w:ascii="Arial" w:cs="Arial" w:eastAsia="Arial" w:hAnsi="Arial"/>
-          <w:b w:val="false"/>
-          <w:bCs w:val="false"/>
+        <w:t xml:space="preserve">Bar path deviation</w:t>
+      </w:r>
+    </w:p>
+    <w:p>
+      <w:pPr>
+        <w:spacing w:after="0" w:before="80"/>
+      </w:pPr>
+      <w:r>
+        <w:t xml:space="preserve"/>
+      </w:r>
+    </w:p>
+    <w:p>
+      <w:pPr>
+        <w:spacing w:after="40" w:before="80"/>
+        <w:jc w:val="left"/>
+      </w:pPr>
+      <w:r>
+        <w:rPr>
+          <w:rFonts w:ascii="Arial" w:cs="Arial" w:eastAsia="Arial" w:hAnsi="Arial"/>
+          <w:b/>
+          <w:bCs/>
           <w:sz w:val="22"/>
           <w:szCs w:val="22"/>
         </w:rPr>
-        <w:t xml:space="preserve">Any Movement Quality alerts are appropriate and correctly worded (see Section 8 for language rules).</w:t>
-      </w:r>
-    </w:p>
-    <w:p>
-      <w:pPr>
-        <w:spacing w:after="0" w:before="120"/>
-      </w:pPr>
-      <w:r>
-        <w:t xml:space="preserve"/>
-      </w:r>
-    </w:p>
-    <w:p>
-      <w:pPr>
-        <w:pStyle w:val="Heading2"/>
-        <w:spacing w:after="100" w:before="200"/>
-      </w:pPr>
-      <w:r>
-        <w:rPr>
-          <w:rFonts w:ascii="Arial" w:cs="Arial" w:eastAsia="Arial" w:hAnsi="Arial"/>
-          <w:b/>
-          <w:bCs/>
-          <w:color w:val="2E75B6"/>
-          <w:sz w:val="26"/>
-          <w:szCs w:val="26"/>
-        </w:rPr>
-        <w:t xml:space="preserve">Targets</w:t>
-      </w:r>
-    </w:p>
-    <w:p>
-      <w:pPr>
-        <w:spacing w:after="100" w:before="60"/>
-        <w:jc w:val="left"/>
-      </w:pPr>
-      <w:r>
-        <w:rPr>
-          <w:rFonts w:ascii="Arial" w:cs="Arial" w:eastAsia="Arial" w:hAnsi="Arial"/>
-          <w:b w:val="false"/>
-          <w:bCs w:val="false"/>
-          <w:sz w:val="22"/>
-          <w:szCs w:val="22"/>
-        </w:rPr>
-        <w:t xml:space="preserve">Aim for approximately 10 % of reviewed analyses to be marked golden. Keep the golden set balanced across exercises and variants to avoid benchmark bias.</w:t>
-      </w:r>
-    </w:p>
-    <w:p>
-      <w:r>
-        <w:br w:type="page"/>
-      </w:r>
-    </w:p>
-    <w:p>
-      <w:pPr>
-        <w:pStyle w:val="Heading1"/>
-        <w:spacing w:after="120" w:before="240"/>
-      </w:pPr>
-      <w:r>
-        <w:rPr>
-          <w:rFonts w:ascii="Arial" w:cs="Arial" w:eastAsia="Arial" w:hAnsi="Arial"/>
-          <w:b/>
-          <w:bCs/>
-          <w:color w:val="1F3864"/>
-          <w:sz w:val="32"/>
-          <w:szCs w:val="32"/>
-        </w:rPr>
-        <w:t xml:space="preserve">6.  Uploading Research Papers</w:t>
-      </w:r>
-    </w:p>
-    <w:p>
-      <w:pPr>
-        <w:spacing w:after="100" w:before="80"/>
-        <w:jc w:val="left"/>
-      </w:pPr>
-      <w:r>
-        <w:rPr>
-          <w:rFonts w:ascii="Arial" w:cs="Arial" w:eastAsia="Arial" w:hAnsi="Arial"/>
-          <w:b w:val="false"/>
-          <w:bCs w:val="false"/>
-          <w:sz w:val="22"/>
-          <w:szCs w:val="22"/>
-        </w:rPr>
-        <w:t xml:space="preserve">Expanding the knowledge base is one of your most impactful contributions. The AI can only cite papers that have been ingested. Upload papers you trust, from high-quality journals.</w:t>
-      </w:r>
-    </w:p>
-    <w:p>
-      <w:pPr>
-        <w:pStyle w:val="Heading2"/>
-        <w:spacing w:after="100" w:before="200"/>
-      </w:pPr>
-      <w:r>
-        <w:rPr>
-          <w:rFonts w:ascii="Arial" w:cs="Arial" w:eastAsia="Arial" w:hAnsi="Arial"/>
-          <w:b/>
-          <w:bCs/>
-          <w:color w:val="2E75B6"/>
-          <w:sz w:val="26"/>
-          <w:szCs w:val="26"/>
-        </w:rPr>
-        <w:t xml:space="preserve">Step-by-Step Upload Process</w:t>
+        <w:t xml:space="preserve">Deadlift issues:</w:t>
       </w:r>
     </w:p>
     <w:p>
@@ -6147,7 +7617,7 @@
           <w:sz w:val="22"/>
           <w:szCs w:val="22"/>
         </w:rPr>
-        <w:t xml:space="preserve">Click Upload Paper in the Expert Portal header.</w:t>
+        <w:t xml:space="preserve">Excessive torso lean at start</w:t>
       </w:r>
     </w:p>
     <w:p>
@@ -6167,7 +7637,7 @@
           <w:sz w:val="22"/>
           <w:szCs w:val="22"/>
         </w:rPr>
-        <w:t xml:space="preserve">Fill in the metadata form (see fields table below). Title and PDF File are required.</w:t>
+        <w:t xml:space="preserve">Incomplete hip extension at lockout</w:t>
       </w:r>
     </w:p>
     <w:p>
@@ -6187,7 +7657,7 @@
           <w:sz w:val="22"/>
           <w:szCs w:val="22"/>
         </w:rPr>
-        <w:t xml:space="preserve">Select your PDF file (max 50 MB).</w:t>
+        <w:t xml:space="preserve">Inconsistent rep tempo</w:t>
       </w:r>
     </w:p>
     <w:p>
@@ -6207,7 +7677,77 @@
           <w:sz w:val="22"/>
           <w:szCs w:val="22"/>
         </w:rPr>
-        <w:t xml:space="preserve">Click the Upload Paper button. A progress bar shows three phases: uploading, extracting, indexing.</w:t>
+        <w:t xml:space="preserve">Bar path deviation</w:t>
+      </w:r>
+    </w:p>
+    <w:p>
+      <w:pPr>
+        <w:spacing w:after="0" w:before="80"/>
+      </w:pPr>
+      <w:r>
+        <w:t xml:space="preserve"/>
+      </w:r>
+    </w:p>
+    <w:p>
+      <w:pPr>
+        <w:spacing w:after="40" w:before="80"/>
+        <w:jc w:val="left"/>
+      </w:pPr>
+      <w:r>
+        <w:rPr>
+          <w:rFonts w:ascii="Arial" w:cs="Arial" w:eastAsia="Arial" w:hAnsi="Arial"/>
+          <w:b/>
+          <w:bCs/>
+          <w:sz w:val="22"/>
+          <w:szCs w:val="22"/>
+        </w:rPr>
+        <w:t xml:space="preserve">Additional free-text fields:</w:t>
+      </w:r>
+    </w:p>
+    <w:p>
+      <w:pPr>
+        <w:spacing w:after="40" w:before="40"/>
+      </w:pPr>
+      <w:r>
+        <w:rPr>
+          <w:rFonts w:ascii="Arial" w:cs="Arial" w:eastAsia="Arial" w:hAnsi="Arial"/>
+          <w:b/>
+          <w:bCs/>
+          <w:sz w:val="22"/>
+          <w:szCs w:val="22"/>
+        </w:rPr>
+        <w:t xml:space="preserve">AI missed an issue</w:t>
+      </w:r>
+      <w:r>
+        <w:rPr>
+          <w:rFonts w:ascii="Arial" w:cs="Arial" w:eastAsia="Arial" w:hAnsi="Arial"/>
+          <w:sz w:val="22"/>
+          <w:szCs w:val="22"/>
+        </w:rPr>
+        <w:t xml:space="preserve"> — describe an issue the AI coaching did not mention.</w:t>
+      </w:r>
+    </w:p>
+    <w:p>
+      <w:pPr>
+        <w:spacing w:after="80" w:before="40"/>
+      </w:pPr>
+      <w:r>
+        <w:rPr>
+          <w:rFonts w:ascii="Arial" w:cs="Arial" w:eastAsia="Arial" w:hAnsi="Arial"/>
+          <w:b/>
+          <w:bCs/>
+          <w:sz w:val="22"/>
+          <w:szCs w:val="22"/>
+        </w:rPr>
+        <w:t xml:space="preserve">AI identified a non-issue</w:t>
+      </w:r>
+      <w:r>
+        <w:rPr>
+          <w:rFonts w:ascii="Arial" w:cs="Arial" w:eastAsia="Arial" w:hAnsi="Arial"/>
+          <w:sz w:val="22"/>
+          <w:szCs w:val="22"/>
+        </w:rPr>
+        <w:t xml:space="preserve"> — describe something the AI flagged that is not actually a problem.</w:t>
       </w:r>
     </w:p>
     <w:p>
@@ -6215,7 +7755,7 @@
         <w:pStyle w:val="ListParagraph"/>
         <w:numPr>
           <w:ilvl w:val="0"/>
-          <w:numId w:val="9"/>
+          <w:numId w:val="6"/>
         </w:numPr>
         <w:spacing w:after="40" w:before="40"/>
       </w:pPr>
@@ -6227,7 +7767,7 @@
           <w:sz w:val="22"/>
           <w:szCs w:val="22"/>
         </w:rPr>
-        <w:t xml:space="preserve">A green success banner confirms the upload.</w:t>
+        <w:t xml:space="preserve">Suggested Corrections — Free-text area. Describe any corrections the AI should have made to its coaching.</w:t>
       </w:r>
     </w:p>
     <w:p>
@@ -6235,7 +7775,7 @@
         <w:pStyle w:val="ListParagraph"/>
         <w:numPr>
           <w:ilvl w:val="0"/>
-          <w:numId w:val="9"/>
+          <w:numId w:val="6"/>
         </w:numPr>
         <w:spacing w:after="40" w:before="40"/>
       </w:pPr>
@@ -6247,7 +7787,7 @@
           <w:sz w:val="22"/>
           <w:szCs w:val="22"/>
         </w:rPr>
-        <w:t xml:space="preserve">The My Papers tab now shows the paper with status Pending.</w:t>
+        <w:t xml:space="preserve">Cited Sources — Add specific papers that support your assessment. Each entry has fields for Title, Authors, Year, and DOI. Click + Add Source to add a row. Click Remove to delete one.</w:t>
       </w:r>
     </w:p>
     <w:p>
@@ -6255,7 +7795,7 @@
         <w:pStyle w:val="ListParagraph"/>
         <w:numPr>
           <w:ilvl w:val="0"/>
-          <w:numId w:val="9"/>
+          <w:numId w:val="6"/>
         </w:numPr>
         <w:spacing w:after="40" w:before="40"/>
       </w:pPr>
@@ -6267,7 +7807,102 @@
           <w:sz w:val="22"/>
           <w:szCs w:val="22"/>
         </w:rPr>
-        <w:t xml:space="preserve">Click Approve &amp; Ingest to start ingestion.</w:t>
+        <w:t xml:space="preserve">Mark as golden dataset entry — Tick this if the analysis and coaching meet all golden quality criteria (see Section 5). Golden entries are used for fine-tuning and evaluation benchmarks.</w:t>
+      </w:r>
+    </w:p>
+    <w:p>
+      <w:pPr>
+        <w:spacing w:after="0" w:before="100"/>
+      </w:pPr>
+      <w:r>
+        <w:t xml:space="preserve"/>
+      </w:r>
+    </w:p>
+    <w:p>
+      <w:pPr>
+        <w:spacing w:after="100" w:before="60"/>
+        <w:jc w:val="left"/>
+      </w:pPr>
+      <w:r>
+        <w:rPr>
+          <w:rFonts w:ascii="Arial" w:cs="Arial" w:eastAsia="Arial" w:hAnsi="Arial"/>
+          <w:b w:val="false"/>
+          <w:bCs w:val="false"/>
+          <w:sz w:val="22"/>
+          <w:szCs w:val="22"/>
+        </w:rPr>
+        <w:t xml:space="preserve">Click Submit. The button changes to Submitting… while the request is in flight. On success a green banner reads: Annotation submitted successfully. If the score is out of range or a network error occurs, a red error message appears below the form.</w:t>
+      </w:r>
+    </w:p>
+    <w:p>
+      <w:r>
+        <w:br w:type="page"/>
+      </w:r>
+    </w:p>
+    <w:p>
+      <w:pPr>
+        <w:pStyle w:val="Heading1"/>
+        <w:spacing w:after="120" w:before="240"/>
+      </w:pPr>
+      <w:r>
+        <w:rPr>
+          <w:rFonts w:ascii="Arial" w:cs="Arial" w:eastAsia="Arial" w:hAnsi="Arial"/>
+          <w:b/>
+          <w:bCs/>
+          <w:color w:val="1F3864"/>
+          <w:sz w:val="32"/>
+          <w:szCs w:val="32"/>
+        </w:rPr>
+        <w:t xml:space="preserve">5.  Golden Dataset Labelling</w:t>
+      </w:r>
+    </w:p>
+    <w:p>
+      <w:pPr>
+        <w:spacing w:after="100" w:before="80"/>
+        <w:jc w:val="left"/>
+      </w:pPr>
+      <w:r>
+        <w:rPr>
+          <w:rFonts w:ascii="Arial" w:cs="Arial" w:eastAsia="Arial" w:hAnsi="Arial"/>
+          <w:b w:val="false"/>
+          <w:bCs w:val="false"/>
+          <w:sz w:val="22"/>
+          <w:szCs w:val="22"/>
+        </w:rPr>
+        <w:t xml:space="preserve">A golden dataset entry is an analysis where the AI coaching was so accurate and complete that it can serve as a benchmark for evaluating future AI outputs. Use this label sparingly.</w:t>
+      </w:r>
+    </w:p>
+    <w:p>
+      <w:pPr>
+        <w:pStyle w:val="Heading2"/>
+        <w:spacing w:after="100" w:before="200"/>
+      </w:pPr>
+      <w:r>
+        <w:rPr>
+          <w:rFonts w:ascii="Arial" w:cs="Arial" w:eastAsia="Arial" w:hAnsi="Arial"/>
+          <w:b/>
+          <w:bCs/>
+          <w:color w:val="2E75B6"/>
+          <w:sz w:val="26"/>
+          <w:szCs w:val="26"/>
+        </w:rPr>
+        <w:t xml:space="preserve">Criteria for a Golden Entry</w:t>
+      </w:r>
+    </w:p>
+    <w:p>
+      <w:pPr>
+        <w:spacing w:after="60" w:before="60"/>
+        <w:jc w:val="left"/>
+      </w:pPr>
+      <w:r>
+        <w:rPr>
+          <w:rFonts w:ascii="Arial" w:cs="Arial" w:eastAsia="Arial" w:hAnsi="Arial"/>
+          <w:b w:val="false"/>
+          <w:bCs w:val="false"/>
+          <w:sz w:val="22"/>
+          <w:szCs w:val="22"/>
+        </w:rPr>
+        <w:t xml:space="preserve">All of the following must be true:</w:t>
       </w:r>
     </w:p>
     <w:p>
@@ -6275,7 +7910,343 @@
         <w:pStyle w:val="ListParagraph"/>
         <w:numPr>
           <w:ilvl w:val="0"/>
-          <w:numId w:val="9"/>
+          <w:numId w:val="10"/>
+        </w:numPr>
+        <w:spacing w:after="40" w:before="40"/>
+      </w:pPr>
+      <w:r>
+        <w:rPr>
+          <w:rFonts w:ascii="Arial" w:cs="Arial" w:eastAsia="Arial" w:hAnsi="Arial"/>
+          <w:b w:val="false"/>
+          <w:bCs w:val="false"/>
+          <w:sz w:val="22"/>
+          <w:szCs w:val="22"/>
+        </w:rPr>
+        <w:t xml:space="preserve">The coaching accurately describes the lift as shown in the annotated video.</w:t>
+      </w:r>
+    </w:p>
+    <w:p>
+      <w:pPr>
+        <w:pStyle w:val="ListParagraph"/>
+        <w:numPr>
+          <w:ilvl w:val="0"/>
+          <w:numId w:val="10"/>
+        </w:numPr>
+        <w:spacing w:after="40" w:before="40"/>
+      </w:pPr>
+      <w:r>
+        <w:rPr>
+          <w:rFonts w:ascii="Arial" w:cs="Arial" w:eastAsia="Arial" w:hAnsi="Arial"/>
+          <w:b w:val="false"/>
+          <w:bCs w:val="false"/>
+          <w:sz w:val="22"/>
+          <w:szCs w:val="22"/>
+        </w:rPr>
+        <w:t xml:space="preserve">All significant issues are identified with correct severity.</w:t>
+      </w:r>
+    </w:p>
+    <w:p>
+      <w:pPr>
+        <w:pStyle w:val="ListParagraph"/>
+        <w:numPr>
+          <w:ilvl w:val="0"/>
+          <w:numId w:val="10"/>
+        </w:numPr>
+        <w:spacing w:after="40" w:before="40"/>
+      </w:pPr>
+      <w:r>
+        <w:rPr>
+          <w:rFonts w:ascii="Arial" w:cs="Arial" w:eastAsia="Arial" w:hAnsi="Arial"/>
+          <w:b w:val="false"/>
+          <w:bCs w:val="false"/>
+          <w:sz w:val="22"/>
+          <w:szCs w:val="22"/>
+        </w:rPr>
+        <w:t xml:space="preserve">No false positives — the AI has not flagged anything that is not actually a problem.</w:t>
+      </w:r>
+    </w:p>
+    <w:p>
+      <w:pPr>
+        <w:pStyle w:val="ListParagraph"/>
+        <w:numPr>
+          <w:ilvl w:val="0"/>
+          <w:numId w:val="10"/>
+        </w:numPr>
+        <w:spacing w:after="40" w:before="40"/>
+      </w:pPr>
+      <w:r>
+        <w:rPr>
+          <w:rFonts w:ascii="Arial" w:cs="Arial" w:eastAsia="Arial" w:hAnsi="Arial"/>
+          <w:b w:val="false"/>
+          <w:bCs w:val="false"/>
+          <w:sz w:val="22"/>
+          <w:szCs w:val="22"/>
+        </w:rPr>
+        <w:t xml:space="preserve">Citations are relevant, correctly attributed, and support the coaching claims.</w:t>
+      </w:r>
+    </w:p>
+    <w:p>
+      <w:pPr>
+        <w:pStyle w:val="ListParagraph"/>
+        <w:numPr>
+          <w:ilvl w:val="0"/>
+          <w:numId w:val="10"/>
+        </w:numPr>
+        <w:spacing w:after="40" w:before="40"/>
+      </w:pPr>
+      <w:r>
+        <w:rPr>
+          <w:rFonts w:ascii="Arial" w:cs="Arial" w:eastAsia="Arial" w:hAnsi="Arial"/>
+          <w:b w:val="false"/>
+          <w:bCs w:val="false"/>
+          <w:sz w:val="22"/>
+          <w:szCs w:val="22"/>
+        </w:rPr>
+        <w:t xml:space="preserve">Any Movement Quality alerts are appropriate and correctly worded (see Section 8 for language rules).</w:t>
+      </w:r>
+    </w:p>
+    <w:p>
+      <w:pPr>
+        <w:spacing w:after="0" w:before="120"/>
+      </w:pPr>
+      <w:r>
+        <w:t xml:space="preserve"/>
+      </w:r>
+    </w:p>
+    <w:p>
+      <w:pPr>
+        <w:pStyle w:val="Heading2"/>
+        <w:spacing w:after="100" w:before="200"/>
+      </w:pPr>
+      <w:r>
+        <w:rPr>
+          <w:rFonts w:ascii="Arial" w:cs="Arial" w:eastAsia="Arial" w:hAnsi="Arial"/>
+          <w:b/>
+          <w:bCs/>
+          <w:color w:val="2E75B6"/>
+          <w:sz w:val="26"/>
+          <w:szCs w:val="26"/>
+        </w:rPr>
+        <w:t xml:space="preserve">Targets</w:t>
+      </w:r>
+    </w:p>
+    <w:p>
+      <w:pPr>
+        <w:spacing w:after="100" w:before="60"/>
+        <w:jc w:val="left"/>
+      </w:pPr>
+      <w:r>
+        <w:rPr>
+          <w:rFonts w:ascii="Arial" w:cs="Arial" w:eastAsia="Arial" w:hAnsi="Arial"/>
+          <w:b w:val="false"/>
+          <w:bCs w:val="false"/>
+          <w:sz w:val="22"/>
+          <w:szCs w:val="22"/>
+        </w:rPr>
+        <w:t xml:space="preserve">Aim for approximately 10 % of reviewed analyses to be marked golden. Keep the golden set balanced across exercises and variants to avoid benchmark bias.</w:t>
+      </w:r>
+    </w:p>
+    <w:p>
+      <w:r>
+        <w:br w:type="page"/>
+      </w:r>
+    </w:p>
+    <w:p>
+      <w:pPr>
+        <w:pStyle w:val="Heading1"/>
+        <w:spacing w:after="120" w:before="240"/>
+      </w:pPr>
+      <w:r>
+        <w:rPr>
+          <w:rFonts w:ascii="Arial" w:cs="Arial" w:eastAsia="Arial" w:hAnsi="Arial"/>
+          <w:b/>
+          <w:bCs/>
+          <w:color w:val="1F3864"/>
+          <w:sz w:val="32"/>
+          <w:szCs w:val="32"/>
+        </w:rPr>
+        <w:t xml:space="preserve">6.  Uploading Research Papers</w:t>
+      </w:r>
+    </w:p>
+    <w:p>
+      <w:pPr>
+        <w:spacing w:after="100" w:before="80"/>
+        <w:jc w:val="left"/>
+      </w:pPr>
+      <w:r>
+        <w:rPr>
+          <w:rFonts w:ascii="Arial" w:cs="Arial" w:eastAsia="Arial" w:hAnsi="Arial"/>
+          <w:b w:val="false"/>
+          <w:bCs w:val="false"/>
+          <w:sz w:val="22"/>
+          <w:szCs w:val="22"/>
+        </w:rPr>
+        <w:t xml:space="preserve">Expanding the knowledge base is one of your most impactful contributions. The AI can only cite papers that have been ingested. Upload papers you trust, from high-quality journals.</w:t>
+      </w:r>
+    </w:p>
+    <w:p>
+      <w:pPr>
+        <w:pStyle w:val="Heading2"/>
+        <w:spacing w:after="100" w:before="200"/>
+      </w:pPr>
+      <w:r>
+        <w:rPr>
+          <w:rFonts w:ascii="Arial" w:cs="Arial" w:eastAsia="Arial" w:hAnsi="Arial"/>
+          <w:b/>
+          <w:bCs/>
+          <w:color w:val="2E75B6"/>
+          <w:sz w:val="26"/>
+          <w:szCs w:val="26"/>
+        </w:rPr>
+        <w:t xml:space="preserve">Step-by-Step Upload Process</w:t>
+      </w:r>
+    </w:p>
+    <w:p>
+      <w:pPr>
+        <w:pStyle w:val="ListParagraph"/>
+        <w:numPr>
+          <w:ilvl w:val="0"/>
+          <w:numId w:val="11"/>
+        </w:numPr>
+        <w:spacing w:after="40" w:before="40"/>
+      </w:pPr>
+      <w:r>
+        <w:rPr>
+          <w:rFonts w:ascii="Arial" w:cs="Arial" w:eastAsia="Arial" w:hAnsi="Arial"/>
+          <w:b w:val="false"/>
+          <w:bCs w:val="false"/>
+          <w:sz w:val="22"/>
+          <w:szCs w:val="22"/>
+        </w:rPr>
+        <w:t xml:space="preserve">Click Upload Paper in the Expert Portal header.</w:t>
+      </w:r>
+    </w:p>
+    <w:p>
+      <w:pPr>
+        <w:pStyle w:val="ListParagraph"/>
+        <w:numPr>
+          <w:ilvl w:val="0"/>
+          <w:numId w:val="11"/>
+        </w:numPr>
+        <w:spacing w:after="40" w:before="40"/>
+      </w:pPr>
+      <w:r>
+        <w:rPr>
+          <w:rFonts w:ascii="Arial" w:cs="Arial" w:eastAsia="Arial" w:hAnsi="Arial"/>
+          <w:b w:val="false"/>
+          <w:bCs w:val="false"/>
+          <w:sz w:val="22"/>
+          <w:szCs w:val="22"/>
+        </w:rPr>
+        <w:t xml:space="preserve">Fill in the metadata form (see fields table below). Title and PDF File are required.</w:t>
+      </w:r>
+    </w:p>
+    <w:p>
+      <w:pPr>
+        <w:pStyle w:val="ListParagraph"/>
+        <w:numPr>
+          <w:ilvl w:val="0"/>
+          <w:numId w:val="11"/>
+        </w:numPr>
+        <w:spacing w:after="40" w:before="40"/>
+      </w:pPr>
+      <w:r>
+        <w:rPr>
+          <w:rFonts w:ascii="Arial" w:cs="Arial" w:eastAsia="Arial" w:hAnsi="Arial"/>
+          <w:b w:val="false"/>
+          <w:bCs w:val="false"/>
+          <w:sz w:val="22"/>
+          <w:szCs w:val="22"/>
+        </w:rPr>
+        <w:t xml:space="preserve">Select your PDF file (max 50 MB).</w:t>
+      </w:r>
+    </w:p>
+    <w:p>
+      <w:pPr>
+        <w:pStyle w:val="ListParagraph"/>
+        <w:numPr>
+          <w:ilvl w:val="0"/>
+          <w:numId w:val="11"/>
+        </w:numPr>
+        <w:spacing w:after="40" w:before="40"/>
+      </w:pPr>
+      <w:r>
+        <w:rPr>
+          <w:rFonts w:ascii="Arial" w:cs="Arial" w:eastAsia="Arial" w:hAnsi="Arial"/>
+          <w:b w:val="false"/>
+          <w:bCs w:val="false"/>
+          <w:sz w:val="22"/>
+          <w:szCs w:val="22"/>
+        </w:rPr>
+        <w:t xml:space="preserve">Click the Upload Paper button. A progress bar shows three phases: uploading, extracting, indexing.</w:t>
+      </w:r>
+    </w:p>
+    <w:p>
+      <w:pPr>
+        <w:pStyle w:val="ListParagraph"/>
+        <w:numPr>
+          <w:ilvl w:val="0"/>
+          <w:numId w:val="11"/>
+        </w:numPr>
+        <w:spacing w:after="40" w:before="40"/>
+      </w:pPr>
+      <w:r>
+        <w:rPr>
+          <w:rFonts w:ascii="Arial" w:cs="Arial" w:eastAsia="Arial" w:hAnsi="Arial"/>
+          <w:b w:val="false"/>
+          <w:bCs w:val="false"/>
+          <w:sz w:val="22"/>
+          <w:szCs w:val="22"/>
+        </w:rPr>
+        <w:t xml:space="preserve">A green success banner confirms the upload.</w:t>
+      </w:r>
+    </w:p>
+    <w:p>
+      <w:pPr>
+        <w:pStyle w:val="ListParagraph"/>
+        <w:numPr>
+          <w:ilvl w:val="0"/>
+          <w:numId w:val="11"/>
+        </w:numPr>
+        <w:spacing w:after="40" w:before="40"/>
+      </w:pPr>
+      <w:r>
+        <w:rPr>
+          <w:rFonts w:ascii="Arial" w:cs="Arial" w:eastAsia="Arial" w:hAnsi="Arial"/>
+          <w:b w:val="false"/>
+          <w:bCs w:val="false"/>
+          <w:sz w:val="22"/>
+          <w:szCs w:val="22"/>
+        </w:rPr>
+        <w:t xml:space="preserve">The My Papers tab now shows the paper with status Pending.</w:t>
+      </w:r>
+    </w:p>
+    <w:p>
+      <w:pPr>
+        <w:pStyle w:val="ListParagraph"/>
+        <w:numPr>
+          <w:ilvl w:val="0"/>
+          <w:numId w:val="11"/>
+        </w:numPr>
+        <w:spacing w:after="40" w:before="40"/>
+      </w:pPr>
+      <w:r>
+        <w:rPr>
+          <w:rFonts w:ascii="Arial" w:cs="Arial" w:eastAsia="Arial" w:hAnsi="Arial"/>
+          <w:b w:val="false"/>
+          <w:bCs w:val="false"/>
+          <w:sz w:val="22"/>
+          <w:szCs w:val="22"/>
+        </w:rPr>
+        <w:t xml:space="preserve">Click Approve &amp; Ingest to start ingestion.</w:t>
+      </w:r>
+    </w:p>
+    <w:p>
+      <w:pPr>
+        <w:pStyle w:val="ListParagraph"/>
+        <w:numPr>
+          <w:ilvl w:val="0"/>
+          <w:numId w:val="11"/>
         </w:numPr>
         <w:spacing w:after="40" w:before="40"/>
       </w:pPr>
@@ -9461,7 +11432,7 @@
         <w:pStyle w:val="ListParagraph"/>
         <w:numPr>
           <w:ilvl w:val="0"/>
-          <w:numId w:val="10"/>
+          <w:numId w:val="12"/>
         </w:numPr>
         <w:spacing w:after="40" w:before="40"/>
       </w:pPr>
@@ -9474,364 +11445,6 @@
           <w:szCs w:val="22"/>
         </w:rPr>
         <w:t xml:space="preserve">Journal of Strength and Conditioning Research</w:t>
-      </w:r>
-    </w:p>
-    <w:p>
-      <w:pPr>
-        <w:pStyle w:val="ListParagraph"/>
-        <w:numPr>
-          <w:ilvl w:val="0"/>
-          <w:numId w:val="10"/>
-        </w:numPr>
-        <w:spacing w:after="40" w:before="40"/>
-      </w:pPr>
-      <w:r>
-        <w:rPr>
-          <w:rFonts w:ascii="Arial" w:cs="Arial" w:eastAsia="Arial" w:hAnsi="Arial"/>
-          <w:b w:val="false"/>
-          <w:bCs w:val="false"/>
-          <w:sz w:val="22"/>
-          <w:szCs w:val="22"/>
-        </w:rPr>
-        <w:t xml:space="preserve">International Journal of Sports Physiology and Performance</w:t>
-      </w:r>
-    </w:p>
-    <w:p>
-      <w:pPr>
-        <w:pStyle w:val="ListParagraph"/>
-        <w:numPr>
-          <w:ilvl w:val="0"/>
-          <w:numId w:val="10"/>
-        </w:numPr>
-        <w:spacing w:after="40" w:before="40"/>
-      </w:pPr>
-      <w:r>
-        <w:rPr>
-          <w:rFonts w:ascii="Arial" w:cs="Arial" w:eastAsia="Arial" w:hAnsi="Arial"/>
-          <w:b w:val="false"/>
-          <w:bCs w:val="false"/>
-          <w:sz w:val="22"/>
-          <w:szCs w:val="22"/>
-        </w:rPr>
-        <w:t xml:space="preserve">Sports Biomechanics</w:t>
-      </w:r>
-    </w:p>
-    <w:p>
-      <w:pPr>
-        <w:pStyle w:val="ListParagraph"/>
-        <w:numPr>
-          <w:ilvl w:val="0"/>
-          <w:numId w:val="10"/>
-        </w:numPr>
-        <w:spacing w:after="40" w:before="40"/>
-      </w:pPr>
-      <w:r>
-        <w:rPr>
-          <w:rFonts w:ascii="Arial" w:cs="Arial" w:eastAsia="Arial" w:hAnsi="Arial"/>
-          <w:b w:val="false"/>
-          <w:bCs w:val="false"/>
-          <w:sz w:val="22"/>
-          <w:szCs w:val="22"/>
-        </w:rPr>
-        <w:t xml:space="preserve">European Journal of Sport Science</w:t>
-      </w:r>
-    </w:p>
-    <w:p>
-      <w:pPr>
-        <w:pStyle w:val="ListParagraph"/>
-        <w:numPr>
-          <w:ilvl w:val="0"/>
-          <w:numId w:val="10"/>
-        </w:numPr>
-        <w:spacing w:after="40" w:before="40"/>
-      </w:pPr>
-      <w:r>
-        <w:rPr>
-          <w:rFonts w:ascii="Arial" w:cs="Arial" w:eastAsia="Arial" w:hAnsi="Arial"/>
-          <w:b w:val="false"/>
-          <w:bCs w:val="false"/>
-          <w:sz w:val="22"/>
-          <w:szCs w:val="22"/>
-        </w:rPr>
-        <w:t xml:space="preserve">Journal of Biomechanics</w:t>
-      </w:r>
-    </w:p>
-    <w:p>
-      <w:pPr>
-        <w:pStyle w:val="ListParagraph"/>
-        <w:numPr>
-          <w:ilvl w:val="0"/>
-          <w:numId w:val="10"/>
-        </w:numPr>
-        <w:spacing w:after="40" w:before="40"/>
-      </w:pPr>
-      <w:r>
-        <w:rPr>
-          <w:rFonts w:ascii="Arial" w:cs="Arial" w:eastAsia="Arial" w:hAnsi="Arial"/>
-          <w:b w:val="false"/>
-          <w:bCs w:val="false"/>
-          <w:sz w:val="22"/>
-          <w:szCs w:val="22"/>
-        </w:rPr>
-        <w:t xml:space="preserve">Medicine &amp; Science in Sports &amp; Exercise</w:t>
-      </w:r>
-    </w:p>
-    <w:p>
-      <w:pPr>
-        <w:spacing w:after="0" w:before="100"/>
-      </w:pPr>
-      <w:r>
-        <w:t xml:space="preserve"/>
-      </w:r>
-    </w:p>
-    <w:p>
-      <w:pPr>
-        <w:spacing w:after="60" w:before="80"/>
-        <w:jc w:val="left"/>
-      </w:pPr>
-      <w:r>
-        <w:rPr>
-          <w:rFonts w:ascii="Arial" w:cs="Arial" w:eastAsia="Arial" w:hAnsi="Arial"/>
-          <w:b/>
-          <w:bCs/>
-          <w:sz w:val="22"/>
-          <w:szCs w:val="22"/>
-        </w:rPr>
-        <w:t xml:space="preserve">Priority topics:</w:t>
-      </w:r>
-    </w:p>
-    <w:p>
-      <w:pPr>
-        <w:pStyle w:val="ListParagraph"/>
-        <w:numPr>
-          <w:ilvl w:val="0"/>
-          <w:numId w:val="11"/>
-        </w:numPr>
-        <w:spacing w:after="40" w:before="40"/>
-      </w:pPr>
-      <w:r>
-        <w:rPr>
-          <w:rFonts w:ascii="Arial" w:cs="Arial" w:eastAsia="Arial" w:hAnsi="Arial"/>
-          <w:b w:val="false"/>
-          <w:bCs w:val="false"/>
-          <w:sz w:val="22"/>
-          <w:szCs w:val="22"/>
-        </w:rPr>
-        <w:t xml:space="preserve">Squat depth, knee tracking, and bar path biomechanics</w:t>
-      </w:r>
-    </w:p>
-    <w:p>
-      <w:pPr>
-        <w:pStyle w:val="ListParagraph"/>
-        <w:numPr>
-          <w:ilvl w:val="0"/>
-          <w:numId w:val="11"/>
-        </w:numPr>
-        <w:spacing w:after="40" w:before="40"/>
-      </w:pPr>
-      <w:r>
-        <w:rPr>
-          <w:rFonts w:ascii="Arial" w:cs="Arial" w:eastAsia="Arial" w:hAnsi="Arial"/>
-          <w:b w:val="false"/>
-          <w:bCs w:val="false"/>
-          <w:sz w:val="22"/>
-          <w:szCs w:val="22"/>
-        </w:rPr>
-        <w:t xml:space="preserve">Bench press shoulder position and pec activation</w:t>
-      </w:r>
-    </w:p>
-    <w:p>
-      <w:pPr>
-        <w:pStyle w:val="ListParagraph"/>
-        <w:numPr>
-          <w:ilvl w:val="0"/>
-          <w:numId w:val="11"/>
-        </w:numPr>
-        <w:spacing w:after="40" w:before="40"/>
-      </w:pPr>
-      <w:r>
-        <w:rPr>
-          <w:rFonts w:ascii="Arial" w:cs="Arial" w:eastAsia="Arial" w:hAnsi="Arial"/>
-          <w:b w:val="false"/>
-          <w:bCs w:val="false"/>
-          <w:sz w:val="22"/>
-          <w:szCs w:val="22"/>
-        </w:rPr>
-        <w:t xml:space="preserve">Deadlift lumbar flexion and hip hinge mechanics</w:t>
-      </w:r>
-    </w:p>
-    <w:p>
-      <w:pPr>
-        <w:pStyle w:val="ListParagraph"/>
-        <w:numPr>
-          <w:ilvl w:val="0"/>
-          <w:numId w:val="11"/>
-        </w:numPr>
-        <w:spacing w:after="40" w:before="40"/>
-      </w:pPr>
-      <w:r>
-        <w:rPr>
-          <w:rFonts w:ascii="Arial" w:cs="Arial" w:eastAsia="Arial" w:hAnsi="Arial"/>
-          <w:b w:val="false"/>
-          <w:bCs w:val="false"/>
-          <w:sz w:val="22"/>
-          <w:szCs w:val="22"/>
-        </w:rPr>
-        <w:t xml:space="preserve">Tempo and rate of force development</w:t>
-      </w:r>
-    </w:p>
-    <w:p>
-      <w:pPr>
-        <w:pStyle w:val="ListParagraph"/>
-        <w:numPr>
-          <w:ilvl w:val="0"/>
-          <w:numId w:val="11"/>
-        </w:numPr>
-        <w:spacing w:after="40" w:before="40"/>
-      </w:pPr>
-      <w:r>
-        <w:rPr>
-          <w:rFonts w:ascii="Arial" w:cs="Arial" w:eastAsia="Arial" w:hAnsi="Arial"/>
-          <w:b w:val="false"/>
-          <w:bCs w:val="false"/>
-          <w:sz w:val="22"/>
-          <w:szCs w:val="22"/>
-        </w:rPr>
-        <w:t xml:space="preserve">Powerlifting technique guidelines and rule books</w:t>
-      </w:r>
-    </w:p>
-    <w:p>
-      <w:r>
-        <w:br w:type="page"/>
-      </w:r>
-    </w:p>
-    <w:p>
-      <w:pPr>
-        <w:pStyle w:val="Heading1"/>
-        <w:spacing w:after="120" w:before="240"/>
-      </w:pPr>
-      <w:r>
-        <w:rPr>
-          <w:rFonts w:ascii="Arial" w:cs="Arial" w:eastAsia="Arial" w:hAnsi="Arial"/>
-          <w:b/>
-          <w:bCs/>
-          <w:color w:val="1F3864"/>
-          <w:sz w:val="32"/>
-          <w:szCs w:val="32"/>
-        </w:rPr>
-        <w:t xml:space="preserve">7.  Threshold Validation</w:t>
-      </w:r>
-    </w:p>
-    <w:p>
-      <w:pPr>
-        <w:spacing w:after="100" w:before="80"/>
-        <w:jc w:val="left"/>
-      </w:pPr>
-      <w:r>
-        <w:rPr>
-          <w:rFonts w:ascii="Arial" w:cs="Arial" w:eastAsia="Arial" w:hAnsi="Arial"/>
-          <w:b w:val="false"/>
-          <w:bCs w:val="false"/>
-          <w:sz w:val="22"/>
-          <w:szCs w:val="22"/>
-        </w:rPr>
-        <w:t xml:space="preserve">Thresholds are the numeric cutoffs the CV pipeline uses to score each movement. For example, the squat depth threshold says that a hip angle ≤90° counts as reaching parallel. If you believe a threshold is wrong based on the literature, you can flag it.</w:t>
-      </w:r>
-    </w:p>
-    <w:p>
-      <w:pPr>
-        <w:pStyle w:val="Heading2"/>
-        <w:spacing w:after="100" w:before="200"/>
-      </w:pPr>
-      <w:r>
-        <w:rPr>
-          <w:rFonts w:ascii="Arial" w:cs="Arial" w:eastAsia="Arial" w:hAnsi="Arial"/>
-          <w:b/>
-          <w:bCs/>
-          <w:color w:val="2E75B6"/>
-          <w:sz w:val="26"/>
-          <w:szCs w:val="26"/>
-        </w:rPr>
-        <w:t xml:space="preserve">Access</w:t>
-      </w:r>
-    </w:p>
-    <w:p>
-      <w:pPr>
-        <w:spacing w:after="60" w:before="60"/>
-        <w:jc w:val="left"/>
-      </w:pPr>
-      <w:r>
-        <w:rPr>
-          <w:rFonts w:ascii="Arial" w:cs="Arial" w:eastAsia="Arial" w:hAnsi="Arial"/>
-          <w:b w:val="false"/>
-          <w:bCs w:val="false"/>
-          <w:sz w:val="22"/>
-          <w:szCs w:val="22"/>
-        </w:rPr>
-        <w:t xml:space="preserve">Click the Validate Thresholds button in the Expert Portal header. This opens a separate page (not a tab). It has two sub-tabs:</w:t>
-      </w:r>
-    </w:p>
-    <w:p>
-      <w:pPr>
-        <w:spacing w:after="40" w:before="40"/>
-      </w:pPr>
-      <w:r>
-        <w:rPr>
-          <w:rFonts w:ascii="Arial" w:cs="Arial" w:eastAsia="Arial" w:hAnsi="Arial"/>
-          <w:b/>
-          <w:bCs/>
-          <w:sz w:val="22"/>
-          <w:szCs w:val="22"/>
-        </w:rPr>
-        <w:t xml:space="preserve">Current Thresholds</w:t>
-      </w:r>
-      <w:r>
-        <w:rPr>
-          <w:rFonts w:ascii="Arial" w:cs="Arial" w:eastAsia="Arial" w:hAnsi="Arial"/>
-          <w:sz w:val="22"/>
-          <w:szCs w:val="22"/>
-        </w:rPr>
-        <w:t xml:space="preserve"> — a read-only table of all active thresholds. Each row has a Flag button.</w:t>
-      </w:r>
-    </w:p>
-    <w:p>
-      <w:pPr>
-        <w:spacing w:after="80" w:before="40"/>
-      </w:pPr>
-      <w:r>
-        <w:rPr>
-          <w:rFonts w:ascii="Arial" w:cs="Arial" w:eastAsia="Arial" w:hAnsi="Arial"/>
-          <w:b/>
-          <w:bCs/>
-          <w:sz w:val="22"/>
-          <w:szCs w:val="22"/>
-        </w:rPr>
-        <w:t xml:space="preserve">My Flags</w:t>
-      </w:r>
-      <w:r>
-        <w:rPr>
-          <w:rFonts w:ascii="Arial" w:cs="Arial" w:eastAsia="Arial" w:hAnsi="Arial"/>
-          <w:sz w:val="22"/>
-          <w:szCs w:val="22"/>
-        </w:rPr>
-        <w:t xml:space="preserve"> — the flags you have submitted, with their review status.</w:t>
-      </w:r>
-    </w:p>
-    <w:p>
-      <w:pPr>
-        <w:pStyle w:val="Heading2"/>
-        <w:spacing w:after="100" w:before="200"/>
-      </w:pPr>
-      <w:r>
-        <w:rPr>
-          <w:rFonts w:ascii="Arial" w:cs="Arial" w:eastAsia="Arial" w:hAnsi="Arial"/>
-          <w:b/>
-          <w:bCs/>
-          <w:color w:val="2E75B6"/>
-          <w:sz w:val="26"/>
-          <w:szCs w:val="26"/>
-        </w:rPr>
-        <w:t xml:space="preserve">How to Flag a Threshold</w:t>
       </w:r>
     </w:p>
     <w:p>
@@ -9851,7 +11464,7 @@
           <w:sz w:val="22"/>
           <w:szCs w:val="22"/>
         </w:rPr>
-        <w:t xml:space="preserve">On the Current Thresholds sub-tab, find the threshold you want to challenge.</w:t>
+        <w:t xml:space="preserve">International Journal of Sports Physiology and Performance</w:t>
       </w:r>
     </w:p>
     <w:p>
@@ -9871,7 +11484,7 @@
           <w:sz w:val="22"/>
           <w:szCs w:val="22"/>
         </w:rPr>
-        <w:t xml:space="preserve">Click the Flag button on that row.</w:t>
+        <w:t xml:space="preserve">Sports Biomechanics</w:t>
       </w:r>
     </w:p>
     <w:p>
@@ -9891,7 +11504,7 @@
           <w:sz w:val="22"/>
           <w:szCs w:val="22"/>
         </w:rPr>
-        <w:t xml:space="preserve">A modal opens with three fields: Proposed Value, Citation (minimum 5 characters), and Rationale (minimum 20 characters).</w:t>
+        <w:t xml:space="preserve">European Journal of Sport Science</w:t>
       </w:r>
     </w:p>
     <w:p>
@@ -9911,7 +11524,7 @@
           <w:sz w:val="22"/>
           <w:szCs w:val="22"/>
         </w:rPr>
-        <w:t xml:space="preserve">Fill in all fields. The citation should be a DOI or a short author-year reference.</w:t>
+        <w:t xml:space="preserve">Journal of Biomechanics</w:t>
       </w:r>
     </w:p>
     <w:p>
@@ -9920,6 +11533,364 @@
         <w:numPr>
           <w:ilvl w:val="0"/>
           <w:numId w:val="12"/>
+        </w:numPr>
+        <w:spacing w:after="40" w:before="40"/>
+      </w:pPr>
+      <w:r>
+        <w:rPr>
+          <w:rFonts w:ascii="Arial" w:cs="Arial" w:eastAsia="Arial" w:hAnsi="Arial"/>
+          <w:b w:val="false"/>
+          <w:bCs w:val="false"/>
+          <w:sz w:val="22"/>
+          <w:szCs w:val="22"/>
+        </w:rPr>
+        <w:t xml:space="preserve">Medicine &amp; Science in Sports &amp; Exercise</w:t>
+      </w:r>
+    </w:p>
+    <w:p>
+      <w:pPr>
+        <w:spacing w:after="0" w:before="100"/>
+      </w:pPr>
+      <w:r>
+        <w:t xml:space="preserve"/>
+      </w:r>
+    </w:p>
+    <w:p>
+      <w:pPr>
+        <w:spacing w:after="60" w:before="80"/>
+        <w:jc w:val="left"/>
+      </w:pPr>
+      <w:r>
+        <w:rPr>
+          <w:rFonts w:ascii="Arial" w:cs="Arial" w:eastAsia="Arial" w:hAnsi="Arial"/>
+          <w:b/>
+          <w:bCs/>
+          <w:sz w:val="22"/>
+          <w:szCs w:val="22"/>
+        </w:rPr>
+        <w:t xml:space="preserve">Priority topics:</w:t>
+      </w:r>
+    </w:p>
+    <w:p>
+      <w:pPr>
+        <w:pStyle w:val="ListParagraph"/>
+        <w:numPr>
+          <w:ilvl w:val="0"/>
+          <w:numId w:val="13"/>
+        </w:numPr>
+        <w:spacing w:after="40" w:before="40"/>
+      </w:pPr>
+      <w:r>
+        <w:rPr>
+          <w:rFonts w:ascii="Arial" w:cs="Arial" w:eastAsia="Arial" w:hAnsi="Arial"/>
+          <w:b w:val="false"/>
+          <w:bCs w:val="false"/>
+          <w:sz w:val="22"/>
+          <w:szCs w:val="22"/>
+        </w:rPr>
+        <w:t xml:space="preserve">Squat depth, knee tracking, and bar path biomechanics</w:t>
+      </w:r>
+    </w:p>
+    <w:p>
+      <w:pPr>
+        <w:pStyle w:val="ListParagraph"/>
+        <w:numPr>
+          <w:ilvl w:val="0"/>
+          <w:numId w:val="13"/>
+        </w:numPr>
+        <w:spacing w:after="40" w:before="40"/>
+      </w:pPr>
+      <w:r>
+        <w:rPr>
+          <w:rFonts w:ascii="Arial" w:cs="Arial" w:eastAsia="Arial" w:hAnsi="Arial"/>
+          <w:b w:val="false"/>
+          <w:bCs w:val="false"/>
+          <w:sz w:val="22"/>
+          <w:szCs w:val="22"/>
+        </w:rPr>
+        <w:t xml:space="preserve">Bench press shoulder position and pec activation</w:t>
+      </w:r>
+    </w:p>
+    <w:p>
+      <w:pPr>
+        <w:pStyle w:val="ListParagraph"/>
+        <w:numPr>
+          <w:ilvl w:val="0"/>
+          <w:numId w:val="13"/>
+        </w:numPr>
+        <w:spacing w:after="40" w:before="40"/>
+      </w:pPr>
+      <w:r>
+        <w:rPr>
+          <w:rFonts w:ascii="Arial" w:cs="Arial" w:eastAsia="Arial" w:hAnsi="Arial"/>
+          <w:b w:val="false"/>
+          <w:bCs w:val="false"/>
+          <w:sz w:val="22"/>
+          <w:szCs w:val="22"/>
+        </w:rPr>
+        <w:t xml:space="preserve">Deadlift lumbar flexion and hip hinge mechanics</w:t>
+      </w:r>
+    </w:p>
+    <w:p>
+      <w:pPr>
+        <w:pStyle w:val="ListParagraph"/>
+        <w:numPr>
+          <w:ilvl w:val="0"/>
+          <w:numId w:val="13"/>
+        </w:numPr>
+        <w:spacing w:after="40" w:before="40"/>
+      </w:pPr>
+      <w:r>
+        <w:rPr>
+          <w:rFonts w:ascii="Arial" w:cs="Arial" w:eastAsia="Arial" w:hAnsi="Arial"/>
+          <w:b w:val="false"/>
+          <w:bCs w:val="false"/>
+          <w:sz w:val="22"/>
+          <w:szCs w:val="22"/>
+        </w:rPr>
+        <w:t xml:space="preserve">Tempo and rate of force development</w:t>
+      </w:r>
+    </w:p>
+    <w:p>
+      <w:pPr>
+        <w:pStyle w:val="ListParagraph"/>
+        <w:numPr>
+          <w:ilvl w:val="0"/>
+          <w:numId w:val="13"/>
+        </w:numPr>
+        <w:spacing w:after="40" w:before="40"/>
+      </w:pPr>
+      <w:r>
+        <w:rPr>
+          <w:rFonts w:ascii="Arial" w:cs="Arial" w:eastAsia="Arial" w:hAnsi="Arial"/>
+          <w:b w:val="false"/>
+          <w:bCs w:val="false"/>
+          <w:sz w:val="22"/>
+          <w:szCs w:val="22"/>
+        </w:rPr>
+        <w:t xml:space="preserve">Powerlifting technique guidelines and rule books</w:t>
+      </w:r>
+    </w:p>
+    <w:p>
+      <w:r>
+        <w:br w:type="page"/>
+      </w:r>
+    </w:p>
+    <w:p>
+      <w:pPr>
+        <w:pStyle w:val="Heading1"/>
+        <w:spacing w:after="120" w:before="240"/>
+      </w:pPr>
+      <w:r>
+        <w:rPr>
+          <w:rFonts w:ascii="Arial" w:cs="Arial" w:eastAsia="Arial" w:hAnsi="Arial"/>
+          <w:b/>
+          <w:bCs/>
+          <w:color w:val="1F3864"/>
+          <w:sz w:val="32"/>
+          <w:szCs w:val="32"/>
+        </w:rPr>
+        <w:t xml:space="preserve">7.  Threshold Validation</w:t>
+      </w:r>
+    </w:p>
+    <w:p>
+      <w:pPr>
+        <w:spacing w:after="100" w:before="80"/>
+        <w:jc w:val="left"/>
+      </w:pPr>
+      <w:r>
+        <w:rPr>
+          <w:rFonts w:ascii="Arial" w:cs="Arial" w:eastAsia="Arial" w:hAnsi="Arial"/>
+          <w:b w:val="false"/>
+          <w:bCs w:val="false"/>
+          <w:sz w:val="22"/>
+          <w:szCs w:val="22"/>
+        </w:rPr>
+        <w:t xml:space="preserve">Thresholds are the numeric cutoffs the CV pipeline uses to score each movement. For example, the squat depth threshold says that a hip angle ≤90° counts as reaching parallel. If you believe a threshold is wrong based on the literature, you can flag it.</w:t>
+      </w:r>
+    </w:p>
+    <w:p>
+      <w:pPr>
+        <w:pStyle w:val="Heading2"/>
+        <w:spacing w:after="100" w:before="200"/>
+      </w:pPr>
+      <w:r>
+        <w:rPr>
+          <w:rFonts w:ascii="Arial" w:cs="Arial" w:eastAsia="Arial" w:hAnsi="Arial"/>
+          <w:b/>
+          <w:bCs/>
+          <w:color w:val="2E75B6"/>
+          <w:sz w:val="26"/>
+          <w:szCs w:val="26"/>
+        </w:rPr>
+        <w:t xml:space="preserve">Access</w:t>
+      </w:r>
+    </w:p>
+    <w:p>
+      <w:pPr>
+        <w:spacing w:after="60" w:before="60"/>
+        <w:jc w:val="left"/>
+      </w:pPr>
+      <w:r>
+        <w:rPr>
+          <w:rFonts w:ascii="Arial" w:cs="Arial" w:eastAsia="Arial" w:hAnsi="Arial"/>
+          <w:b w:val="false"/>
+          <w:bCs w:val="false"/>
+          <w:sz w:val="22"/>
+          <w:szCs w:val="22"/>
+        </w:rPr>
+        <w:t xml:space="preserve">Click the Validate Thresholds button in the Expert Portal header. This opens a separate page (not a tab). It has two sub-tabs:</w:t>
+      </w:r>
+    </w:p>
+    <w:p>
+      <w:pPr>
+        <w:spacing w:after="40" w:before="40"/>
+      </w:pPr>
+      <w:r>
+        <w:rPr>
+          <w:rFonts w:ascii="Arial" w:cs="Arial" w:eastAsia="Arial" w:hAnsi="Arial"/>
+          <w:b/>
+          <w:bCs/>
+          <w:sz w:val="22"/>
+          <w:szCs w:val="22"/>
+        </w:rPr>
+        <w:t xml:space="preserve">Current Thresholds</w:t>
+      </w:r>
+      <w:r>
+        <w:rPr>
+          <w:rFonts w:ascii="Arial" w:cs="Arial" w:eastAsia="Arial" w:hAnsi="Arial"/>
+          <w:sz w:val="22"/>
+          <w:szCs w:val="22"/>
+        </w:rPr>
+        <w:t xml:space="preserve"> — a read-only table of all active thresholds. Each row has a Flag button.</w:t>
+      </w:r>
+    </w:p>
+    <w:p>
+      <w:pPr>
+        <w:spacing w:after="80" w:before="40"/>
+      </w:pPr>
+      <w:r>
+        <w:rPr>
+          <w:rFonts w:ascii="Arial" w:cs="Arial" w:eastAsia="Arial" w:hAnsi="Arial"/>
+          <w:b/>
+          <w:bCs/>
+          <w:sz w:val="22"/>
+          <w:szCs w:val="22"/>
+        </w:rPr>
+        <w:t xml:space="preserve">My Flags</w:t>
+      </w:r>
+      <w:r>
+        <w:rPr>
+          <w:rFonts w:ascii="Arial" w:cs="Arial" w:eastAsia="Arial" w:hAnsi="Arial"/>
+          <w:sz w:val="22"/>
+          <w:szCs w:val="22"/>
+        </w:rPr>
+        <w:t xml:space="preserve"> — the flags you have submitted, with their review status.</w:t>
+      </w:r>
+    </w:p>
+    <w:p>
+      <w:pPr>
+        <w:pStyle w:val="Heading2"/>
+        <w:spacing w:after="100" w:before="200"/>
+      </w:pPr>
+      <w:r>
+        <w:rPr>
+          <w:rFonts w:ascii="Arial" w:cs="Arial" w:eastAsia="Arial" w:hAnsi="Arial"/>
+          <w:b/>
+          <w:bCs/>
+          <w:color w:val="2E75B6"/>
+          <w:sz w:val="26"/>
+          <w:szCs w:val="26"/>
+        </w:rPr>
+        <w:t xml:space="preserve">How to Flag a Threshold</w:t>
+      </w:r>
+    </w:p>
+    <w:p>
+      <w:pPr>
+        <w:pStyle w:val="ListParagraph"/>
+        <w:numPr>
+          <w:ilvl w:val="0"/>
+          <w:numId w:val="14"/>
+        </w:numPr>
+        <w:spacing w:after="40" w:before="40"/>
+      </w:pPr>
+      <w:r>
+        <w:rPr>
+          <w:rFonts w:ascii="Arial" w:cs="Arial" w:eastAsia="Arial" w:hAnsi="Arial"/>
+          <w:b w:val="false"/>
+          <w:bCs w:val="false"/>
+          <w:sz w:val="22"/>
+          <w:szCs w:val="22"/>
+        </w:rPr>
+        <w:t xml:space="preserve">On the Current Thresholds sub-tab, find the threshold you want to challenge.</w:t>
+      </w:r>
+    </w:p>
+    <w:p>
+      <w:pPr>
+        <w:pStyle w:val="ListParagraph"/>
+        <w:numPr>
+          <w:ilvl w:val="0"/>
+          <w:numId w:val="14"/>
+        </w:numPr>
+        <w:spacing w:after="40" w:before="40"/>
+      </w:pPr>
+      <w:r>
+        <w:rPr>
+          <w:rFonts w:ascii="Arial" w:cs="Arial" w:eastAsia="Arial" w:hAnsi="Arial"/>
+          <w:b w:val="false"/>
+          <w:bCs w:val="false"/>
+          <w:sz w:val="22"/>
+          <w:szCs w:val="22"/>
+        </w:rPr>
+        <w:t xml:space="preserve">Click the Flag button on that row.</w:t>
+      </w:r>
+    </w:p>
+    <w:p>
+      <w:pPr>
+        <w:pStyle w:val="ListParagraph"/>
+        <w:numPr>
+          <w:ilvl w:val="0"/>
+          <w:numId w:val="14"/>
+        </w:numPr>
+        <w:spacing w:after="40" w:before="40"/>
+      </w:pPr>
+      <w:r>
+        <w:rPr>
+          <w:rFonts w:ascii="Arial" w:cs="Arial" w:eastAsia="Arial" w:hAnsi="Arial"/>
+          <w:b w:val="false"/>
+          <w:bCs w:val="false"/>
+          <w:sz w:val="22"/>
+          <w:szCs w:val="22"/>
+        </w:rPr>
+        <w:t xml:space="preserve">A modal opens with three fields: Proposed Value, Citation (minimum 5 characters), and Rationale (minimum 20 characters).</w:t>
+      </w:r>
+    </w:p>
+    <w:p>
+      <w:pPr>
+        <w:pStyle w:val="ListParagraph"/>
+        <w:numPr>
+          <w:ilvl w:val="0"/>
+          <w:numId w:val="14"/>
+        </w:numPr>
+        <w:spacing w:after="40" w:before="40"/>
+      </w:pPr>
+      <w:r>
+        <w:rPr>
+          <w:rFonts w:ascii="Arial" w:cs="Arial" w:eastAsia="Arial" w:hAnsi="Arial"/>
+          <w:b w:val="false"/>
+          <w:bCs w:val="false"/>
+          <w:sz w:val="22"/>
+          <w:szCs w:val="22"/>
+        </w:rPr>
+        <w:t xml:space="preserve">Fill in all fields. The citation should be a DOI or a short author-year reference.</w:t>
+      </w:r>
+    </w:p>
+    <w:p>
+      <w:pPr>
+        <w:pStyle w:val="ListParagraph"/>
+        <w:numPr>
+          <w:ilvl w:val="0"/>
+          <w:numId w:val="14"/>
         </w:numPr>
         <w:spacing w:after="40" w:before="40"/>
       </w:pPr>
@@ -13897,7 +15868,7 @@
         <w:pStyle w:val="ListParagraph"/>
         <w:numPr>
           <w:ilvl w:val="0"/>
-          <w:numId w:val="13"/>
+          <w:numId w:val="15"/>
         </w:numPr>
         <w:spacing w:after="40" w:before="40"/>
       </w:pPr>
@@ -13917,7 +15888,7 @@
         <w:pStyle w:val="ListParagraph"/>
         <w:numPr>
           <w:ilvl w:val="0"/>
-          <w:numId w:val="13"/>
+          <w:numId w:val="15"/>
         </w:numPr>
         <w:spacing w:after="40" w:before="40"/>
       </w:pPr>
@@ -13937,7 +15908,7 @@
         <w:pStyle w:val="ListParagraph"/>
         <w:numPr>
           <w:ilvl w:val="0"/>
-          <w:numId w:val="13"/>
+          <w:numId w:val="15"/>
         </w:numPr>
         <w:spacing w:after="40" w:before="40"/>
       </w:pPr>
@@ -13957,7 +15928,7 @@
         <w:pStyle w:val="ListParagraph"/>
         <w:numPr>
           <w:ilvl w:val="0"/>
-          <w:numId w:val="13"/>
+          <w:numId w:val="15"/>
         </w:numPr>
         <w:spacing w:after="40" w:before="40"/>
       </w:pPr>
@@ -14057,7 +16028,7 @@
         <w:pStyle w:val="ListParagraph"/>
         <w:numPr>
           <w:ilvl w:val="0"/>
-          <w:numId w:val="14"/>
+          <w:numId w:val="16"/>
         </w:numPr>
         <w:spacing w:after="40" w:before="40"/>
       </w:pPr>
@@ -14077,7 +16048,7 @@
         <w:pStyle w:val="ListParagraph"/>
         <w:numPr>
           <w:ilvl w:val="0"/>
-          <w:numId w:val="14"/>
+          <w:numId w:val="16"/>
         </w:numPr>
         <w:spacing w:after="40" w:before="40"/>
       </w:pPr>
@@ -14097,7 +16068,7 @@
         <w:pStyle w:val="ListParagraph"/>
         <w:numPr>
           <w:ilvl w:val="0"/>
-          <w:numId w:val="14"/>
+          <w:numId w:val="16"/>
         </w:numPr>
         <w:spacing w:after="40" w:before="40"/>
       </w:pPr>
@@ -14142,7 +16113,7 @@
         <w:pStyle w:val="ListParagraph"/>
         <w:numPr>
           <w:ilvl w:val="0"/>
-          <w:numId w:val="14"/>
+          <w:numId w:val="16"/>
         </w:numPr>
         <w:spacing w:after="40" w:before="40"/>
       </w:pPr>
@@ -14162,7 +16133,7 @@
         <w:pStyle w:val="ListParagraph"/>
         <w:numPr>
           <w:ilvl w:val="0"/>
-          <w:numId w:val="14"/>
+          <w:numId w:val="16"/>
         </w:numPr>
         <w:spacing w:after="40" w:before="40"/>
       </w:pPr>
@@ -14182,7 +16153,7 @@
         <w:pStyle w:val="ListParagraph"/>
         <w:numPr>
           <w:ilvl w:val="0"/>
-          <w:numId w:val="14"/>
+          <w:numId w:val="16"/>
         </w:numPr>
         <w:spacing w:after="40" w:before="40"/>
       </w:pPr>
@@ -14260,7 +16231,7 @@
         <w:pStyle w:val="ListParagraph"/>
         <w:numPr>
           <w:ilvl w:val="0"/>
-          <w:numId w:val="14"/>
+          <w:numId w:val="16"/>
         </w:numPr>
         <w:spacing w:after="40" w:before="40"/>
       </w:pPr>
@@ -14280,7 +16251,7 @@
         <w:pStyle w:val="ListParagraph"/>
         <w:numPr>
           <w:ilvl w:val="0"/>
-          <w:numId w:val="14"/>
+          <w:numId w:val="16"/>
         </w:numPr>
         <w:spacing w:after="40" w:before="40"/>
       </w:pPr>
@@ -14300,7 +16271,7 @@
         <w:pStyle w:val="ListParagraph"/>
         <w:numPr>
           <w:ilvl w:val="0"/>
-          <w:numId w:val="14"/>
+          <w:numId w:val="16"/>
         </w:numPr>
         <w:spacing w:after="40" w:before="40"/>
       </w:pPr>
@@ -18674,6 +20645,36 @@
       </w:rPr>
     </w:lvl>
   </w:abstractNum>
+  <w:abstractNum w:abstractNumId="21" w15:restartNumberingAfterBreak="0">
+    <w:multiLevelType w:val="hybridMultilevel"/>
+    <w:lvl w:ilvl="0" w15:tentative="1">
+      <w:start w:val="1"/>
+      <w:numFmt w:val="decimal"/>
+      <w:lvlText w:val="%1."/>
+      <w:lvlJc w:val="left"/>
+      <w:pPr>
+        <w:ind w:left="720" w:hanging="360"/>
+      </w:pPr>
+      <w:rPr>
+        <w:rFonts w:ascii="Arial" w:cs="Arial" w:eastAsia="Arial" w:hAnsi="Arial"/>
+      </w:rPr>
+    </w:lvl>
+  </w:abstractNum>
+  <w:abstractNum w:abstractNumId="22" w15:restartNumberingAfterBreak="0">
+    <w:multiLevelType w:val="hybridMultilevel"/>
+    <w:lvl w:ilvl="0" w15:tentative="1">
+      <w:start w:val="1"/>
+      <w:numFmt w:val="bullet"/>
+      <w:lvlText w:val="•"/>
+      <w:lvlJc w:val="left"/>
+      <w:pPr>
+        <w:ind w:left="720" w:hanging="360"/>
+      </w:pPr>
+      <w:rPr>
+        <w:rFonts w:ascii="Arial" w:cs="Arial" w:eastAsia="Arial" w:hAnsi="Arial"/>
+      </w:rPr>
+    </w:lvl>
+  </w:abstractNum>
   <w:num w:numId="1">
     <w:abstractNumId w:val="1"/>
     <w:lvlOverride w:ilvl="0">
@@ -18693,66 +20694,78 @@
     </w:lvlOverride>
   </w:num>
   <w:num w:numId="4">
+    <w:abstractNumId w:val="21"/>
+    <w:lvlOverride w:ilvl="0">
+      <w:startOverride w:val="1"/>
+    </w:lvlOverride>
+  </w:num>
+  <w:num w:numId="5">
+    <w:abstractNumId w:val="22"/>
+    <w:lvlOverride w:ilvl="0">
+      <w:startOverride w:val="1"/>
+    </w:lvlOverride>
+  </w:num>
+  <w:num w:numId="6">
     <w:abstractNumId w:val="8"/>
     <w:lvlOverride w:ilvl="0">
       <w:startOverride w:val="1"/>
     </w:lvlOverride>
   </w:num>
-  <w:num w:numId="5">
+  <w:num w:numId="7">
     <w:abstractNumId w:val="9"/>
     <w:lvlOverride w:ilvl="0">
       <w:startOverride w:val="1"/>
     </w:lvlOverride>
   </w:num>
-  <w:num w:numId="6">
+  <w:num w:numId="8">
     <w:abstractNumId w:val="10"/>
     <w:lvlOverride w:ilvl="0">
       <w:startOverride w:val="1"/>
     </w:lvlOverride>
   </w:num>
-  <w:num w:numId="7">
+  <w:num w:numId="9">
     <w:abstractNumId w:val="11"/>
     <w:lvlOverride w:ilvl="0">
       <w:startOverride w:val="1"/>
     </w:lvlOverride>
   </w:num>
-  <w:num w:numId="8">
+  <w:num w:numId="10">
     <w:abstractNumId w:val="12"/>
     <w:lvlOverride w:ilvl="0">
       <w:startOverride w:val="1"/>
     </w:lvlOverride>
   </w:num>
-  <w:num w:numId="9">
+  <w:num w:numId="11">
     <w:abstractNumId w:val="13"/>
     <w:lvlOverride w:ilvl="0">
       <w:startOverride w:val="1"/>
     </w:lvlOverride>
   </w:num>
-  <w:num w:numId="10">
+  <w:num w:numId="12">
     <w:abstractNumId w:val="15"/>
     <w:lvlOverride w:ilvl="0">
       <w:startOverride w:val="1"/>
     </w:lvlOverride>
   </w:num>
-  <w:num w:numId="11">
+  <w:num w:numId="13">
     <w:abstractNumId w:val="14"/>
     <w:lvlOverride w:ilvl="0">
       <w:startOverride w:val="1"/>
     </w:lvlOverride>
   </w:num>
-  <w:num w:numId="12">
+  <w:num w:numId="14">
     <w:abstractNumId w:val="16"/>
     <w:lvlOverride w:ilvl="0">
       <w:startOverride w:val="1"/>
     </w:lvlOverride>
   </w:num>
-  <w:num w:numId="13">
+  <w:num w:numId="15">
     <w:abstractNumId w:val="18"/>
     <w:lvlOverride w:ilvl="0">
       <w:startOverride w:val="1"/>
     </w:lvlOverride>
   </w:num>
-  <w:num w:numId="14">
+  <w:num w:numId="16">
     <w:abstractNumId w:val="19"/>
     <w:lvlOverride w:ilvl="0">
       <w:startOverride w:val="1"/>

</xml_diff>

<commit_message>
docs(expert): fix 10 vague/inaccurate descriptions in reviewer guide
1. Section 4.1 score table: brief summaries, cross-ref to Section 9
2. Section 9 score table: full detailed descriptions with weights
3. Password: regenerated from correct script (no plaintext)
4. Priority order: "user or system" → "system or administrator"
5. Auto-failed: appears on detail page, not in Analysis ID column
6. My Papers Authors: "First author et al" → "Comma-separated list"
7. Approved status: "Ingestion complete" → "queued for ingestion"
8. Needs Revision: "PDF could not be parsed" → "admin requested changes"
9. Coach Brain: simplified two-path explanation (auto + annotations)
10. Upload progress: "uploading/extracting/indexing" → actual button labels
</commit_message>
<xml_diff>
--- a/Spelix_Expert_Reviewer_Guide.docx
+++ b/Spelix_Expert_Reviewer_Guide.docx
@@ -3533,7 +3533,7 @@
           <w:sz w:val="22"/>
           <w:szCs w:val="22"/>
         </w:rPr>
-        <w:t xml:space="preserve">Flagged — highest priority. A user or the system has raised a concern.</w:t>
+        <w:t xml:space="preserve">Flagged — highest priority. The system or an administrator has flagged a concern.</w:t>
       </w:r>
     </w:p>
     <w:p>
@@ -3614,7 +3614,7 @@
           <w:sz w:val="22"/>
           <w:szCs w:val="22"/>
         </w:rPr>
-        <w:t xml:space="preserve">A nightly cleanup job runs at 03:30 UTC and automatically marks any analysis that has been stuck in a non-terminal state for more than 2 hours as failed. These entries appear with an "Auto-failed:" prefix in the Analysis ID column. They produce no coaching output. Skip them unless they are also flagged.</w:t>
+        <w:t xml:space="preserve">A nightly cleanup job runs at 03:30 UTC and automatically marks any analysis that has been stuck in a non-terminal state for more than 2 hours as failed. When you open the detail page, you will see an error message starting with "Auto-failed:". These analyses produce no coaching output. Skip them unless they are also flagged.</w:t>
       </w:r>
     </w:p>
     <w:p>
@@ -3881,7 +3881,7 @@
                 <w:sz w:val="22"/>
                 <w:szCs w:val="22"/>
               </w:rPr>
-              <w:t xml:space="preserve">Weighted average of the four dimension scores.</w:t>
+              <w:t xml:space="preserve">Weighted composite of the four dimensions below (see Section 9 for weights and detail).</w:t>
             </w:r>
           </w:p>
         </w:tc>
@@ -3953,7 +3953,7 @@
                 <w:sz w:val="22"/>
                 <w:szCs w:val="22"/>
               </w:rPr>
-              <w:t xml:space="preserve">Biomechanical safety indicators detectable by camera angle.</w:t>
+              <w:t xml:space="preserve">Excessive torso lean, acute knee angles, shoulder/elbow range violations. Score &lt; 3.0 triggers a red alert.</w:t>
             </w:r>
           </w:p>
         </w:tc>
@@ -4025,7 +4025,7 @@
                 <w:sz w:val="22"/>
                 <w:szCs w:val="22"/>
               </w:rPr>
-              <w:t xml:space="preserve">Execution quality relative to the target variant.</w:t>
+              <w:t xml:space="preserve">Squat depth vs parallel, hip hinge depth, elbow angle range, rep-to-rep depth consistency.</w:t>
             </w:r>
           </w:p>
         </w:tc>
@@ -4097,7 +4097,7 @@
                 <w:sz w:val="22"/>
                 <w:szCs w:val="22"/>
               </w:rPr>
-              <w:t xml:space="preserve">Bar path linearity and centre-of-mass stability.</w:t>
+              <w:t xml:space="preserve">Bar path consistency across reps and front-to-back deviation from midfoot. Defaults to 5.0 if bar path data unavailable.</w:t>
             </w:r>
           </w:p>
         </w:tc>
@@ -4169,7 +4169,7 @@
                 <w:sz w:val="22"/>
                 <w:szCs w:val="22"/>
               </w:rPr>
-              <w:t xml:space="preserve">Tempo, deceleration, and rep consistency.</w:t>
+              <w:t xml:space="preserve">Descent tempo (penalises drops &lt; 1.0–1.5 s) and lockout completeness (hip+knee or elbow ≥ 165°).</w:t>
             </w:r>
           </w:p>
         </w:tc>
@@ -8178,7 +8178,7 @@
           <w:sz w:val="22"/>
           <w:szCs w:val="22"/>
         </w:rPr>
-        <w:t xml:space="preserve">Click the Upload Paper button. A progress bar shows three phases: uploading, extracting, indexing.</w:t>
+        <w:t xml:space="preserve">Click the Upload Paper button. The button label changes through three stages: "Requesting upload URL..." → "Uploading..." (with a progress bar and percentage) → "Finalizing...". Wait for it to complete.</w:t>
       </w:r>
     </w:p>
     <w:p>
@@ -10364,7 +10364,7 @@
                 <w:sz w:val="22"/>
                 <w:szCs w:val="22"/>
               </w:rPr>
-              <w:t xml:space="preserve">First author et al.</w:t>
+              <w:t xml:space="preserve">Comma-separated author list (may be truncated for long lists).</w:t>
             </w:r>
           </w:p>
         </w:tc>
@@ -11166,7 +11166,7 @@
                 <w:sz w:val="22"/>
                 <w:szCs w:val="22"/>
               </w:rPr>
-              <w:t xml:space="preserve">Ingestion complete. Chunks &gt; 0.</w:t>
+              <w:t xml:space="preserve">Approved and queued for ingestion. Chunks update once processing completes (1–2 min).</w:t>
             </w:r>
           </w:p>
         </w:tc>
@@ -11380,7 +11380,7 @@
                 <w:sz w:val="22"/>
                 <w:szCs w:val="22"/>
               </w:rPr>
-              <w:t xml:space="preserve">Metadata is incomplete or the PDF could not be parsed.</w:t>
+              <w:t xml:space="preserve">An administrator has requested changes before the paper can be approved.</w:t>
             </w:r>
           </w:p>
         </w:tc>
@@ -12945,7 +12945,7 @@
                 <w:sz w:val="22"/>
                 <w:szCs w:val="22"/>
               </w:rPr>
-              <w:t xml:space="preserve">Movement Quality</w:t>
+              <w:t xml:space="preserve">Movement Quality (40%)</w:t>
             </w:r>
           </w:p>
         </w:tc>
@@ -12980,7 +12980,7 @@
                 <w:sz w:val="22"/>
                 <w:szCs w:val="22"/>
               </w:rPr>
-              <w:t xml:space="preserve">Camera-detectable biomechanical safety indicators (e.g. depth, spinal neutrality, knee tracking).</w:t>
+              <w:t xml:space="preserve">Penalises threshold violations that indicate potentially harmful mechanics: excessive torso lean (squat/deadlift), acute knee angle at depth (squat), excessive shoulder opening (bench), elbow/shoulder range violations (bench). Capped at 5.0 when confidence is Very Low. Score &lt; 3.0 triggers a red alert banner.</w:t>
             </w:r>
           </w:p>
         </w:tc>
@@ -13017,7 +13017,7 @@
                 <w:sz w:val="22"/>
                 <w:szCs w:val="22"/>
               </w:rPr>
-              <w:t xml:space="preserve">Technique</w:t>
+              <w:t xml:space="preserve">Technique (30%)</w:t>
             </w:r>
           </w:p>
         </w:tc>
@@ -13052,7 +13052,7 @@
                 <w:sz w:val="22"/>
                 <w:szCs w:val="22"/>
               </w:rPr>
-              <w:t xml:space="preserve">Adherence to correct execution for the target exercise variant.</w:t>
+              <w:t xml:space="preserve">Evaluates execution against the target variant: squat depth relative to parallel, hip hinge depth (deadlift), elbow angle range at bottom (bench), plus rep-to-rep depth consistency across all exercises (std dev &gt; 10° triggers a penalty).</w:t>
             </w:r>
           </w:p>
         </w:tc>
@@ -13089,7 +13089,7 @@
                 <w:sz w:val="22"/>
                 <w:szCs w:val="22"/>
               </w:rPr>
-              <w:t xml:space="preserve">Path &amp; Balance</w:t>
+              <w:t xml:space="preserve">Path &amp; Balance (20%)</w:t>
             </w:r>
           </w:p>
         </w:tc>
@@ -13124,7 +13124,7 @@
                 <w:sz w:val="22"/>
                 <w:szCs w:val="22"/>
               </w:rPr>
-              <w:t xml:space="preserve">Bar path linearity and lifter centre-of-mass stability across the rep.</w:t>
+              <w:t xml:space="preserve">Bar path consistency (how repeatable the bar trajectory is across reps) and anterior-posterior deviation (how far the bar drifts from the midfoot line). Returns a default 5.0 when bar path data is unavailable.</w:t>
             </w:r>
           </w:p>
         </w:tc>
@@ -13161,7 +13161,7 @@
                 <w:sz w:val="22"/>
                 <w:szCs w:val="22"/>
               </w:rPr>
-              <w:t xml:space="preserve">Control</w:t>
+              <w:t xml:space="preserve">Control (10%)</w:t>
             </w:r>
           </w:p>
         </w:tc>
@@ -13196,7 +13196,7 @@
                 <w:sz w:val="22"/>
                 <w:szCs w:val="22"/>
               </w:rPr>
-              <w:t xml:space="preserve">Rep tempo, deceleration quality, and consistency across multiple reps.</w:t>
+              <w:t xml:space="preserve">Eccentric (descent) tempo — penalises drops faster than 1.0 s or 1.5 s — plus lockout completeness at the top of each rep (hip+knee ≥ 165° for squat/deadlift, elbow ≥ 165° for bench).</w:t>
             </w:r>
           </w:p>
         </w:tc>
@@ -13268,7 +13268,7 @@
                 <w:sz w:val="22"/>
                 <w:szCs w:val="22"/>
               </w:rPr>
-              <w:t xml:space="preserve">Weighted combination of the four dimensions above.</w:t>
+              <w:t xml:space="preserve">Weighted composite of the four dimensions above. Weights shown in parentheses.</w:t>
             </w:r>
           </w:p>
         </w:tc>
@@ -15860,7 +15860,23 @@
           <w:sz w:val="26"/>
           <w:szCs w:val="26"/>
         </w:rPr>
-        <w:t xml:space="preserve">How Annotations Feed Coach Brain</w:t>
+        <w:t xml:space="preserve">How Your Work Feeds Coach Brain</w:t>
+      </w:r>
+    </w:p>
+    <w:p>
+      <w:pPr>
+        <w:spacing w:after="60" w:before="60"/>
+        <w:jc w:val="left"/>
+      </w:pPr>
+      <w:r>
+        <w:rPr>
+          <w:rFonts w:ascii="Arial" w:cs="Arial" w:eastAsia="Arial" w:hAnsi="Arial"/>
+          <w:b w:val="false"/>
+          <w:bCs w:val="false"/>
+          <w:sz w:val="22"/>
+          <w:szCs w:val="22"/>
+        </w:rPr>
+        <w:t xml:space="preserve">Two processes feed Coach Brain — one automated, one driven by your annotations:</w:t>
       </w:r>
     </w:p>
     <w:p>
@@ -15880,7 +15896,7 @@
           <w:sz w:val="22"/>
           <w:szCs w:val="22"/>
         </w:rPr>
-        <w:t xml:space="preserve">When you submit an annotation, the analysis becomes a candidate for distillation if its automated eval scores meet the internal quality threshold.</w:t>
+        <w:t xml:space="preserve">An automated pipeline extracts candidate coaching insights from every completed analysis that passes a quality threshold. These candidates are reviewed by an administrator before entering Coach Brain.</w:t>
       </w:r>
     </w:p>
     <w:p>
@@ -15900,7 +15916,7 @@
           <w:sz w:val="22"/>
           <w:szCs w:val="22"/>
         </w:rPr>
-        <w:t xml:space="preserve">When you correct an issue, the correction is used to refine the coaching patterns the AI applies to similar lifts.</w:t>
+        <w:t xml:space="preserve">Your annotations inform which candidates are approved or rejected. When you flag issues or correct coaching, the administrator uses your feedback to decide what enters the knowledge base.</w:t>
       </w:r>
     </w:p>
     <w:p>
@@ -15920,27 +15936,7 @@
           <w:sz w:val="22"/>
           <w:szCs w:val="22"/>
         </w:rPr>
-        <w:t xml:space="preserve">When you mark an analysis as a golden entry, it enters the evaluation benchmark that is used to measure AI quality over time.</w:t>
-      </w:r>
-    </w:p>
-    <w:p>
-      <w:pPr>
-        <w:pStyle w:val="ListParagraph"/>
-        <w:numPr>
-          <w:ilvl w:val="0"/>
-          <w:numId w:val="15"/>
-        </w:numPr>
-        <w:spacing w:after="40" w:before="40"/>
-      </w:pPr>
-      <w:r>
-        <w:rPr>
-          <w:rFonts w:ascii="Arial" w:cs="Arial" w:eastAsia="Arial" w:hAnsi="Arial"/>
-          <w:b w:val="false"/>
-          <w:bCs w:val="false"/>
-          <w:sz w:val="22"/>
-          <w:szCs w:val="22"/>
-        </w:rPr>
-        <w:t xml:space="preserve">Distillation candidates are reviewed by an administrator before being committed to the Coach Brain.</w:t>
+        <w:t xml:space="preserve">When you mark an analysis as a golden entry, it enters a benchmark dataset used to measure AI quality over time.</w:t>
       </w:r>
     </w:p>
     <w:p>

</xml_diff>

<commit_message>
docs: close cv-audit Session 7 + effort complete (ADR, backlog, manifest, guide v2.2, handoff)
- ADR-LUMBAR-FLEXION-PROXY-NAMING in decisions.md (naming honesty, baseline-frame
  decisions incl. DL first-rep, J-curve v0, consistency metric, None-storage,
  occlusion guard).
- backlog: L2-SAGITTAL-COMPLEX-01..03 done; effort-complete note.
- master manifest: Session 7 -> complete; ALL 7 sessions complete + summary.
- Expert Reviewer Guide -> v2.2 (Section 13: all 16 sagittal metrics + scope).
- handoff: final completion + calibration results + post-onboarding follow-ups.
</commit_message>
<xml_diff>
--- a/Spelix_Expert_Reviewer_Guide.docx
+++ b/Spelix_Expert_Reviewer_Guide.docx
@@ -71,7 +71,7 @@
           <w:sz w:val="24"/>
           <w:szCs w:val="24"/>
         </w:rPr>
-        <w:t xml:space="preserve">Version 2.1  |  May 2026</w:t>
+        <w:t xml:space="preserve">Version 2.2  |  May 2026</w:t>
       </w:r>
     </w:p>
     <w:p>
@@ -20093,6 +20093,56 @@
           <w:szCs w:val="22"/>
         </w:rPr>
         <w:t xml:space="preserve">Note: all angle measurements use the anatomical convention (full extension = 180°) unless otherwise stated.</w:t>
+      </w:r>
+    </w:p>
+    <w:p>
+      <w:pPr>
+        <w:spacing w:after="120" w:before="240"/>
+        <w:jc w:val="left"/>
+        <w:rPr>
+          <w:b/>
+          <w:bCs/>
+          <w:color w:val="1F3864"/>
+          <w:sz w:val="32"/>
+          <w:szCs w:val="32"/>
+        </w:rPr>
+      </w:pPr>
+      <w:r>
+        <w:rPr>
+          <w:b/>
+          <w:bCs/>
+          <w:color w:val="1F3864"/>
+          <w:sz w:val="32"/>
+          <w:szCs w:val="32"/>
+        </w:rPr>
+        <w:t xml:space="preserve">13.  Sagittal-View Measurement Scope (All 16 Metrics)</w:t>
+      </w:r>
+    </w:p>
+    <w:p>
+      <w:pPr>
+        <w:spacing w:after="100" w:before="80"/>
+        <w:jc w:val="left"/>
+      </w:pPr>
+      <w:r>
+        <w:t xml:space="preserve">Spelix measures from a single sagittal (side-on) camera view. All sixteen metrics below are derived from 2D pose landmarks in the sagittal plane. Measurements that require a frontal-plane camera — true knee valgus, grip and stance width, and scapular retraction — are out of scope and explicitly deferred. Where a metric is an approximation of a 3D quantity it is named as a proxy (for example, Lumbar Flexion Proxy is a composite torso angle, not a lumbar-isolated measurement).</w:t>
+      </w:r>
+    </w:p>
+    <w:p>
+      <w:pPr>
+        <w:spacing w:after="100" w:before="80"/>
+        <w:jc w:val="left"/>
+      </w:pPr>
+      <w:r>
+        <w:t xml:space="preserve">The sixteen sagittal metrics: (1) Ankle Dorsiflexion, (2) Lumbar Flexion Proxy (Delta), (3) Wrist Alignment, (4) Bar-to-Hip Distance, (5) Bar Touch Height, (6) Bar Path Classification, (7) Depth Classification [scored], (8) Eccentric / Concentric Ratio [scored], (9) Pause Duration, (10) Setup Shoulder Offset, (11) Shin Angle, (12) Lockout Torso Lean, (13) Setup Knee Angle, (14) Shoulder Protraction Proxy, (15) Arch Angle, (16) Technique Consistency. The two items marked [scored] contribute to the form score today. The remaining fourteen are computed and shown in the Unvalidated Metrics panel but do NOT affect scores until you validate their thresholds.</w:t>
+      </w:r>
+    </w:p>
+    <w:p>
+      <w:pPr>
+        <w:spacing w:after="100" w:before="80"/>
+        <w:jc w:val="left"/>
+      </w:pPr>
+      <w:r>
+        <w:t xml:space="preserve">Validating Unvalidated Metrics: open any analysis in the expert portal and review the Unvalidated Metrics panel. Each row shows the computed value alongside a one-line description of what the metric does and does not measure. When you judge a metric is ready to influence scoring, propose its threshold through the flagging workflow; the panel header restates that these values are computed but not yet scored, so validate each against the video before flagging.</w:t>
       </w:r>
     </w:p>
     <w:sectPr>

</xml_diff>